<commit_message>
Actualizar cierre audiovisual y logo de JaqueBot
</commit_message>
<xml_diff>
--- a/downloads/guion-jaquebot-2026.docx
+++ b/downloads/guion-jaquebot-2026.docx
@@ -1993,7 +1993,7 @@
         <w:widowControl/>
       </w:pPr>
       <w:r>
-        <w:t>JaqueBot, Ajedrez que cobra movimiento. Ahora presentamos el video de nuestro proceso.</w:t>
+        <w:t>Presentamos tres minutos de diseño, pruebas y construcción de JaqueBot.</w:t>
       </w:r>
     </w:p>
     <w:p>
@@ -2251,7 +2251,7 @@
                 <w:b w:val="0"/>
                 <w:sz w:val="18"/>
               </w:rPr>
-              <w:t>Idea del proyecto y esquema de consulta a ChatGPT Codex</w:t>
+              <w:t>Idea, repositorio real de EduSCARA, modelo y lista de piezas</w:t>
             </w:r>
           </w:p>
         </w:tc>
@@ -2321,7 +2321,7 @@
                 <w:b w:val="0"/>
                 <w:sz w:val="18"/>
               </w:rPr>
-              <w:t>Desarrollo y ajustes</w:t>
+              <w:t>Desarrollo y fracaso</w:t>
             </w:r>
           </w:p>
         </w:tc>
@@ -2353,7 +2353,7 @@
                 <w:b w:val="0"/>
                 <w:sz w:val="18"/>
               </w:rPr>
-              <w:t>Pruebas de movimiento, interfaces y explicación de la depuración</w:t>
+              <w:t>Impresión 3D, ajustes y extractos reales de conversaciones con Codex</w:t>
             </w:r>
           </w:p>
         </w:tc>
@@ -2455,7 +2455,7 @@
                 <w:b w:val="0"/>
                 <w:sz w:val="18"/>
               </w:rPr>
-              <w:t>Diseño, piezas, herramientas, ensamble y conexiones del equipo</w:t>
+              <w:t>Timelapse de armado, soldadura, fijaciones, fotos y dos aplicaciones</w:t>
             </w:r>
           </w:p>
         </w:tc>
@@ -2525,7 +2525,7 @@
                 <w:b w:val="0"/>
                 <w:sz w:val="18"/>
               </w:rPr>
-              <w:t>El resultado</w:t>
+              <w:t>El éxito</w:t>
             </w:r>
           </w:p>
         </w:tc>
@@ -2557,7 +2557,7 @@
                 <w:b w:val="0"/>
                 <w:sz w:val="18"/>
               </w:rPr>
-              <w:t>Prototipo, pruebas disponibles, equipo y cierre de JaqueBot</w:t>
+              <w:t>Pruebas disponibles del prototipo, equipo y cierre de JaqueBot</w:t>
             </w:r>
           </w:p>
         </w:tc>
@@ -2574,7 +2574,7 @@
           <w:color w:val="414141"/>
           <w:sz w:val="19"/>
         </w:rPr>
-        <w:t>El tramo de 150 a 180 segundos usa el prototipo y las pruebas disponibles. Se reemplazará por el clip final de funcionamiento completo cuando el equipo lo aporte. La consulta a la IA se muestra como esquema o reconstrucción gráfica identificada, no como captura histórica.</w:t>
+        <w:t>El video reúne 26 evidencias del equipo, narración masculina en español latinoamericano de ElevenLabs y música. La interfaz animada de Codex reproduce extractos reales del 25 de septiembre, 4 y 11 de octubre de 2026, con el rótulo Conversación real · extractos · interfaz recreada. El cierre usa las pruebas disponibles; después se incorporará la grabación del funcionamiento completo.</w:t>
       </w:r>
     </w:p>
     <w:p>
@@ -2609,7 +2609,7 @@
         <w:rPr>
           <w:sz w:val="20"/>
         </w:rPr>
-        <w:t>JaqueBot nació de una idea: explorar cómo un brazo robótico puede mover y clasificar objetos para ayudar a optimizar tareas repetitivas. Nosotros elegimos el ajedrez para demostrar esa capacidad. Cada jugada exige reconocer una pieza, calcular un destino y convertir una decisión digital en movimiento físico. Así conectamos lo que aprendimos en sistemas con un prototipo real.</w:t>
+        <w:t>¿Cómo convertir una idea en un robot capaz de actuar? En el colegio nos propusimos explorar una tarea real: mover objetos para ayudar a optimizar procesos repetitivos. Elegimos el ajedrez como demostración. Partimos de EduSCARA, una plataforma abierta: consultamos su publicación, descargamos el modelo y revisamos las piezas. Ahí empezó JaqueBot.</w:t>
       </w:r>
     </w:p>
     <w:p>
@@ -2623,7 +2623,7 @@
           <w:b/>
           <w:sz w:val="20"/>
         </w:rPr>
-        <w:t>00:30 a 01:30   Desarrollo y ajustes</w:t>
+        <w:t>00:30 a 01:30   Desarrollo y fracaso</w:t>
       </w:r>
     </w:p>
     <w:p>
@@ -2635,7 +2635,7 @@
         <w:rPr>
           <w:sz w:val="20"/>
         </w:rPr>
-        <w:t>El desarrollo reunió mecánica, electrónica y programación. Usamos ChatGPT Codex como apoyo para revisar soluciones, describiendo el hardware disponible, sus límites y el protocolo del robot. La inteligencia artificial necesitó orientación y comprobación. Durante una captura aparecieron lecturas distintas de posición. Aprendimos que recibir una respuesta del controlador no demuestra que el brazo haya llegado. Reforzamos la verificación con lecturas consecutivas y evitamos repetir automáticamente un traslado fallido. También ajustamos la coordinación del estacionamiento y de la herramienta. Los registros de estas pruebas nos ayudaron a encontrar problemas y decidir qué revisar antes de continuar.</w:t>
+        <w:t>La lista de piezas se convirtió en trabajo de taller: impresión en tres dimensiones, pruebas de ajuste y primeros montajes. Pero ensamblar no bastaba. Había que coordinar sensores, motores y código. Con ChatGPT Codex describimos el hardware, revisamos Python y el firmware de la STM32, y contrastamos cada propuesta con pruebas. Hubo calibraciones incompletas y posiciones que no coincidían con lo esperado. Una respuesta del controlador no significaba que el brazo hubiera llegado. Por eso reforzamos la verificación con tres lecturas consecutivas y evitamos repetir automáticamente un traslado fallido. No avanzamos por adivinar: observamos, registramos y corregimos. Cada intento nos enseñó algo.</w:t>
       </w:r>
     </w:p>
     <w:p>
@@ -2661,7 +2661,7 @@
         <w:rPr>
           <w:sz w:val="20"/>
         </w:rPr>
-        <w:t>En Autodesk Fusion adaptamos la plataforma EduSCARA y el conjunto del tablero, las piezas y los soportes. La fabricación y el ensamble hicieron tangible el diseño. Integramos los servomotores, los potenciómetros, la NUCLEO y la Raspberry Pi con su cámara. El electroimán añadió la posibilidad de sujetar y liberar las piezas. Construimos dos aplicaciones. JaqueBot manual permite preparar y controlar el brazo, mover sus articulaciones y probar la herramienta. JaqueBot Ajedrez combina visión con ArUco, reglas de juego y el motor Stockfish. La aplicación organiza los movimientos y comprueba el resultado antes de continuar. Cada componente cumple una función dentro del mismo sistema.</w:t>
+        <w:t>Después vino la integración. Engranajes, eslabones, tornillos y soportes: cada pieza debía encajar. Soldamos conexiones, ordenamos cables y fijamos los componentes. En Autodesk Fusion adaptamos el conjunto del tablero, las piezas y la cámara. La Raspberry Pi coordina el sistema; la NUCLEO controla el movimiento. El electroimán permite sujetar y liberar. También construimos dos aplicaciones. JaqueBot manual prepara y controla el brazo. JaqueBot Ajedrez observa el tablero con la cámara y etiquetas ArUco; verifica las reglas y consulta a Stockfish para elegir una jugada. Nuestra aplicación transforma esa decisión en una secuencia de movimientos. Diseño, electrónica y programación dejaron de ser partes separadas: empezaron a trabajar juntas.</w:t>
       </w:r>
     </w:p>
     <w:p>
@@ -2675,7 +2675,7 @@
           <w:b/>
           <w:sz w:val="20"/>
         </w:rPr>
-        <w:t>02:30 a 03:00   El resultado</w:t>
+        <w:t>02:30 a 03:00   El éxito</w:t>
       </w:r>
     </w:p>
     <w:p>
@@ -2687,7 +2687,7 @@
         <w:rPr>
           <w:sz w:val="20"/>
         </w:rPr>
-        <w:t>Hoy presentamos el prototipo terminado. La aplicación calcula una jugada y el brazo activa el electroimán para mover la pieza. El tablero pequeño requiere supervisión: piezas cercanas pueden levantarse juntas. Para producción tendríamos que adaptar el tamaño y la herramienta, y medir el desempeño. Somos estudiantes de once C. JaqueBot: ajedrez que cobra movimiento.</w:t>
+        <w:t>Hoy, JaqueBot reúne dos aplicaciones y un prototipo terminado. El programa calcula la jugada y coordina el brazo y el electroimán. Aún requiere supervisión: en este tablero pequeño, piezas cercanas pueden levantarse juntas. Para una aplicación industrial adaptaríamos tamaño y herramienta, y mediríamos su desempeño. Esto es lo que construimos y aprendimos. JaqueBot: una idea que cobra movimiento.</w:t>
       </w:r>
     </w:p>
     <w:p>

</xml_diff>

<commit_message>
Relaciona Matemáticas y Sistemas con el robot y señala cada diapositiva
</commit_message>
<xml_diff>
--- a/downloads/guion-jaquebot-2026.docx
+++ b/downloads/guion-jaquebot-2026.docx
@@ -20,7 +20,7 @@
     </w:p>
     <w:p>
       <w:r>
-        <w:t>Este guion acompaña las diapositivas actuales y explica el proyecto a personas sin conocimientos previos de robótica. Indica qué dice cada rol, qué debe mostrar y cuándo cambia de expositor. El objetivo es que el público comprenda para qué sirve el brazo, cómo lo construimos, cómo funciona y qué aprendimos.</w:t>
+        <w:t>Este guion acompaña las diapositivas actuales y explica JaqueBot sin exigir conocimientos previos de robótica. Indica qué dice cada rol, qué diapositiva mostrar y cuándo cambia de expositor. El público debe comprender cómo unimos visión artificial, inteligencia artificial y mecánica con lo aprendido en Matemáticas y Sistemas para construir y controlar el brazo, para qué sirve y qué aprendimos.</w:t>
       </w:r>
     </w:p>
     <w:p>
@@ -446,7 +446,7 @@
                 <w:b w:val="0"/>
                 <w:sz w:val="19"/>
               </w:rPr>
-              <w:t>Movimiento, sensores de posición e imán</w:t>
+              <w:t>Movimiento, coordenadas, ángulos e imán</w:t>
             </w:r>
           </w:p>
         </w:tc>
@@ -1013,13 +1013,9 @@
       </w:hyperlink>
     </w:p>
     <w:p>
-      <w:r>
-        <w:br w:type="page"/>
-      </w:r>
-    </w:p>
-    <w:p>
       <w:pPr>
         <w:pStyle w:val="Heading1"/>
+        <w:pageBreakBefore/>
       </w:pPr>
       <w:r>
         <w:t>Gestor de proyecto</w:t>
@@ -1045,7 +1041,7 @@
         <w:rPr>
           <w:sz w:val="20"/>
         </w:rPr>
-        <w:t>Presentar desde el inicio el objetivo, la utilidad y el recorrido completo del proyecto. Resumir el presupuesto en un máximo de 25 segundos y dejar los cálculos en un anexo.</w:t>
+        <w:t>Presentar el objetivo de aprendizaje: integrar visión artificial, inteligencia artificial y mecánica, aplicando lo visto en Matemáticas, geometría, Sistemas y los cursos previos de Arduino. Distinguir esa formación previa de la placa STM32 utilizada en JaqueBot. Explicar la proyección industrial y resumir el presupuesto en 20 segundos.</w:t>
       </w:r>
     </w:p>
     <w:p>
@@ -1057,7 +1053,7 @@
           <w:i/>
           <w:sz w:val="19"/>
         </w:rPr>
-        <w:t>Qué mostrar. Abrir los capítulos 1, 2 y 3. Explicar el objetivo y señalar el recorrido cámara → programas → placa → movimiento → revisión. Pasar brevemente al capítulo 15 para el resumen de presupuesto. La tabla completa se consulta en el anexo; no leer filas, sumas largas ni centavos. No operar el brazo en este bloque.</w:t>
+        <w:t>Qué mostrar. DIAPOSITIVA 1 «JaqueBot» (portada) → DIAPOSITIVA 2 «Del tablero a la industria.» → DIAPOSITIVA 3 «Una decisión. Un movimiento.» → DIAPOSITIVA 15 «Construir con criterio.». Presentar el objetivo de aprendizaje, la utilidad y el recorrido del sistema. Mostrar el presupuesto solo durante 20 segundos; el detalle queda en el anexo.</w:t>
       </w:r>
     </w:p>
     <w:p>
@@ -1086,13 +1082,13 @@
             <w:u w:val="single"/>
             <w:sz w:val="19"/>
           </w:rPr>
-          <w:t>Capítulo 1</w:t>
+          <w:t>DIAPOSITIVA 1 «JaqueBot» (portada)</w:t>
         </w:r>
       </w:hyperlink>
     </w:p>
     <w:p>
       <w:r>
-        <w:t>Buenos días, jurados, docentes y compañeros. Somos JaqueBot, del grado once C de la Institución Educativa Carlos Julio Torrado Peñaranda, del Técnico en Sistemas Teleinformáticos. Nuestro objetivo fue desarrollar un brazo robótico para mover objetos y explorar cómo agilizar tareas repetitivas. Hoy presentamos el prototipo construido: Ajedrez que cobra movimiento.</w:t>
+        <w:t>Buenos días, jurados, docentes y compañeros. Somos JaqueBot, del grado once C de la Institución Educativa Carlos Julio Torrado Peñaranda, del Técnico en Sistemas Teleinformáticos. Nuestro objetivo fue aprender a integrar visión artificial, inteligencia artificial y mecánica, aplicando lo visto en Matemáticas y Sistemas para mover objetos con un brazo robótico. JaqueBot: Ajedrez que cobra movimiento.</w:t>
       </w:r>
     </w:p>
     <w:p>
@@ -1121,7 +1117,7 @@
             <w:u w:val="single"/>
             <w:sz w:val="19"/>
           </w:rPr>
-          <w:t>Capítulo 2</w:t>
+          <w:t>DIAPOSITIVA 2 «Del tablero a la industria.»</w:t>
         </w:r>
       </w:hyperlink>
     </w:p>
@@ -1156,13 +1152,13 @@
             <w:u w:val="single"/>
             <w:sz w:val="19"/>
           </w:rPr>
-          <w:t>Capítulo 3</w:t>
+          <w:t>DIAPOSITIVA 3 «Una decisión. Un movimiento.»</w:t>
         </w:r>
       </w:hyperlink>
     </w:p>
     <w:p>
       <w:r>
-        <w:t>Para demostrar esa idea usamos EduSCARA, un diseño educativo publicado, y construimos el prototipo. Creamos una aplicación para probar el brazo y otra para jugar ajedrez. El recorrido es sencillo: la cámara observa, el programa interpreta, la placa recibe instrucciones y los motores actúan. Después se revisa el resultado. Las pruebas requieren supervisión.</w:t>
+        <w:t>Usamos EduSCARA, un diseño educativo publicado, y construimos el brazo y dos aplicaciones. Unimos matemáticas y geometría con Sistemas: programación, electrónica y conexiones practicadas antes en cursos de Arduino. En JaqueBot aplicamos esas bases con la placa STM32. Relacionamos una imagen con una posición y con el giro de los motores: la cámara observa, el programa interpreta y el brazo actúa.</w:t>
       </w:r>
     </w:p>
     <w:p>
@@ -1191,7 +1187,7 @@
             <w:u w:val="single"/>
             <w:sz w:val="19"/>
           </w:rPr>
-          <w:t>Capítulo 15</w:t>
+          <w:t>DIAPOSITIVA 15 «Construir con criterio.»</w:t>
         </w:r>
       </w:hyperlink>
     </w:p>
@@ -1213,13 +1209,9 @@
       </w:r>
     </w:p>
     <w:p>
-      <w:r>
-        <w:br w:type="page"/>
-      </w:r>
-    </w:p>
-    <w:p>
       <w:pPr>
         <w:pStyle w:val="Heading1"/>
+        <w:pageBreakBefore/>
       </w:pPr>
       <w:r>
         <w:t>Ingeniero de IA</w:t>
@@ -1257,7 +1249,7 @@
           <w:i/>
           <w:sz w:val="19"/>
         </w:rPr>
-        <w:t>Qué mostrar. Abrir el capítulo 4. Mostrar la conversación reconstruida y su identificación. Relacionar lo mostrado con el código y los registros del proyecto. No presentar una reconstrucción como captura literal del historial ni atribuir a Codex la elección de jugadas.</w:t>
+        <w:t>Qué mostrar. DIAPOSITIVA 4 «La IA acompaña. Nosotros comprobamos.». Mostrar la conversación reconstruida identificada y los registros de pruebas. Explicar qué propuso Codex y qué comprobó el equipo.</w:t>
       </w:r>
     </w:p>
     <w:p>
@@ -1286,7 +1278,7 @@
             <w:u w:val="single"/>
             <w:sz w:val="19"/>
           </w:rPr>
-          <w:t>Capítulo 4</w:t>
+          <w:t>DIAPOSITIVA 4 «La IA acompaña. Nosotros comprobamos.»</w:t>
         </w:r>
       </w:hyperlink>
     </w:p>
@@ -1321,7 +1313,7 @@
             <w:u w:val="single"/>
             <w:sz w:val="19"/>
           </w:rPr>
-          <w:t>Capítulo 4</w:t>
+          <w:t>DIAPOSITIVA 4 «La IA acompaña. Nosotros comprobamos.»</w:t>
         </w:r>
       </w:hyperlink>
     </w:p>
@@ -1331,13 +1323,9 @@
       </w:r>
     </w:p>
     <w:p>
-      <w:r>
-        <w:br w:type="page"/>
-      </w:r>
-    </w:p>
-    <w:p>
       <w:pPr>
         <w:pStyle w:val="Heading1"/>
+        <w:pageBreakBefore/>
       </w:pPr>
       <w:r>
         <w:t>Hardware primer aprendiz</w:t>
@@ -1375,7 +1363,7 @@
           <w:i/>
           <w:sz w:val="19"/>
         </w:rPr>
-        <w:t>Qué mostrar. Abrir los capítulos 5 y 6. Señalar base, codo, piezas impresas, servomotores, sensores de posición y electroimán en el modelo 3D y en el prototipo quieto. Mantener las manos fuera de su recorrido cuando esté funcionando.</w:t>
+        <w:t>Qué mostrar. DIAPOSITIVA 5 «Dos eslabones. Un espacio de trabajo.» → DIAPOSITIVA 6 «Acercar. Sujetar. Trasladar. Soltar.». Señalar estructura, motores, sensores y electroimán en el modelo y en el prototipo quieto. Los 90 grados son un ejemplo geométrico, no una orden de movimiento.</w:t>
       </w:r>
     </w:p>
     <w:p>
@@ -1404,13 +1392,13 @@
             <w:u w:val="single"/>
             <w:sz w:val="19"/>
           </w:rPr>
-          <w:t>Capítulo 5</w:t>
+          <w:t>DIAPOSITIVA 5 «Dos eslabones. Un espacio de trabajo.»</w:t>
         </w:r>
       </w:hyperlink>
     </w:p>
     <w:p>
       <w:r>
-        <w:t>Esta es la parte que produce el movimiento. La base gira y el codo cambia la posición del extremo, de forma parecida a nuestro brazo. Usamos servomotores: motores que reciben la orden de girar hasta una posición determinada. Es como una puerta que debe abrirse hasta cierto ángulo: necesitamos que alcance una posición, no que dé vueltas sin parar. Los engranajes transmiten ese movimiento y los tornillos sujetan el conjunto. Los potenciómetros son como perillas que cambian una señal al girar; los usamos como sensores, es decir, para obtener información de la posición. El programa interpreta esa señal para estimar cuánto giraron la base y el codo. Los usamos para comparar la posición esperada con la leída. Una pieza floja puede afectar esa precisión, aunque el programa esté bien escrito.</w:t>
+        <w:t>La base gira y el codo cambia la posición del extremo, como nuestro brazo. Usamos servomotores: motores que reciben la orden de alcanzar una posición, como una puerta que se abre hasta un ángulo. Los potenciómetros funcionan como sensores: su señal cambia al girar, como una perilla. Nos permiten estimar la posición y compararla con la esperada. Los engranajes transmiten movimiento y los tornillos sujetan el conjunto. También usamos matemáticas: X e Y indican dónde está el extremo sobre el tablero; los grados describen cuánto gira una articulación. Un cuarto de vuelta son noventa grados, como el ángulo de la esquina de un cuaderno. Así vemos la geometría convertirse en movimiento.</w:t>
       </w:r>
     </w:p>
     <w:p>
@@ -1439,7 +1427,7 @@
             <w:u w:val="single"/>
             <w:sz w:val="19"/>
           </w:rPr>
-          <w:t>Capítulo 6</w:t>
+          <w:t>DIAPOSITIVA 6 «Acercar. Sujetar. Trasladar. Soltar.»</w:t>
         </w:r>
       </w:hyperlink>
     </w:p>
@@ -1449,13 +1437,9 @@
       </w:r>
     </w:p>
     <w:p>
-      <w:r>
-        <w:br w:type="page"/>
-      </w:r>
-    </w:p>
-    <w:p>
       <w:pPr>
         <w:pStyle w:val="Heading1"/>
+        <w:pageBreakBefore/>
       </w:pPr>
       <w:r>
         <w:t>Hardware segundo aprendiz</w:t>
@@ -1493,7 +1477,7 @@
           <w:i/>
           <w:sz w:val="19"/>
         </w:rPr>
-        <w:t>Qué mostrar. Abrir los capítulos 7 y 8. Enfocar primero la Raspberry Pi, después la cámara Sony, las etiquetas de las piezas, la NUCLEO y la alimentación. Explicar las conexiones sin convertir el guion en instrucciones de cableado. No confundir la vista 3D con una lectura del robot en ese momento.</w:t>
+        <w:t>Qué mostrar. DIAPOSITIVA 7 «Cada pieza tiene una identidad.» → DIAPOSITIVA 8 «Cada señal tiene una función.». Señalar Raspberry, cámara, etiquetas, NUCLEO y alimentación. Explicar las conexiones sin manipularlas durante la exposición.</w:t>
       </w:r>
     </w:p>
     <w:p>
@@ -1522,13 +1506,13 @@
             <w:u w:val="single"/>
             <w:sz w:val="19"/>
           </w:rPr>
-          <w:t>Capítulo 7</w:t>
+          <w:t>DIAPOSITIVA 7 «Cada pieza tiene una identidad.»</w:t>
         </w:r>
       </w:hyperlink>
     </w:p>
     <w:p>
       <w:r>
-        <w:t>La Raspberry Pi es una computadora pequeña que organiza el trabajo: ejecuta las aplicaciones, recibe la imagen y coordina lo que debe ocurrir. La cámara es una Raspberry Pi AI Camera con sensor Sony. Su función aquí es fotografiar el tablero; no decide la jugada. Sobre las piezas hay etiquetas ArUco: pequeños dibujos cuadrados con una identidad distinta, como una etiqueta con el nombre de cada pieza. Los elegimos para distinguir las piezas con más claridad. OpenCV es un conjunto de herramientas para analizar imágenes; lo usamos para reconocer esas etiquetas y ubicarlas. Antes debemos calibrar: enseñar la relación entre lo que aparece en la imagen, las casillas y los lugares que alcanza el brazo. Si movemos cámara o tablero, revisamos esa relación.</w:t>
+        <w:t>La Raspberry Pi es una computadora pequeña: organiza las aplicaciones y recibe imágenes de la Raspberry Pi AI Camera con sensor Sony. Usamos visión artificial: programas que extraen información de una imagen. Aquí reconocen las etiquetas ArUco, dibujos cuadrados con una identidad para cada pieza. OpenCV es el conjunto de herramientas que usamos para analizarlas. No es una cámara que entiende todo sola. Debemos calibrar: relacionar la imagen, las casillas y los lugares que alcanza el brazo. Aprendimos que importan la luz, las etiquetas visibles y la posición de cámara y tablero. Si algo cambia, revisamos las referencias antes de seguir.</w:t>
       </w:r>
     </w:p>
     <w:p>
@@ -1557,7 +1541,7 @@
             <w:u w:val="single"/>
             <w:sz w:val="19"/>
           </w:rPr>
-          <w:t>Capítulo 8</w:t>
+          <w:t>DIAPOSITIVA 8 «Cada señal tiene una función.»</w:t>
         </w:r>
       </w:hyperlink>
     </w:p>
@@ -1567,13 +1551,9 @@
       </w:r>
     </w:p>
     <w:p>
-      <w:r>
-        <w:br w:type="page"/>
-      </w:r>
-    </w:p>
-    <w:p>
       <w:pPr>
         <w:pStyle w:val="Heading1"/>
+        <w:pageBreakBefore/>
       </w:pPr>
       <w:r>
         <w:t>Desarrollador</w:t>
@@ -1611,7 +1591,7 @@
           <w:i/>
           <w:sz w:val="19"/>
         </w:rPr>
-        <w:t>Qué mostrar. Abrir los capítulos 9 y 10. Mostrar las capturas reales de ambas aplicaciones. Usar la secuencia e2 a e4 como ejemplo narrado; no prometer una respuesta fija de Stockfish ni ejecutar valores del guion como órdenes de movimiento. Si se nombran Python o C, usar la explicación del glosario en una respuesta, no añadir una lista de lenguajes a la exposición.</w:t>
+        <w:t>Qué mostrar. DIAPOSITIVA 9 «App 01. Control en tus manos.» → DIAPOSITIVA 10 «App 02. El tablero responde.». Mostrar las dos aplicaciones reales y seguir el ejemplo e2-e4. No prometer una respuesta fija de Stockfish ni ejecutar valores del guion como órdenes.</w:t>
       </w:r>
     </w:p>
     <w:p>
@@ -1640,7 +1620,7 @@
             <w:u w:val="single"/>
             <w:sz w:val="19"/>
           </w:rPr>
-          <w:t>Capítulo 9</w:t>
+          <w:t>DIAPOSITIVA 9 «App 01. Control en tus manos.»</w:t>
         </w:r>
       </w:hyperlink>
     </w:p>
@@ -1675,7 +1655,7 @@
             <w:u w:val="single"/>
             <w:sz w:val="19"/>
           </w:rPr>
-          <w:t>Capítulo 10</w:t>
+          <w:t>DIAPOSITIVA 10 «App 02. El tablero responde.»</w:t>
         </w:r>
       </w:hyperlink>
     </w:p>
@@ -1685,13 +1665,9 @@
       </w:r>
     </w:p>
     <w:p>
-      <w:r>
-        <w:br w:type="page"/>
-      </w:r>
-    </w:p>
-    <w:p>
       <w:pPr>
         <w:pStyle w:val="Heading1"/>
+        <w:pageBreakBefore/>
       </w:pPr>
       <w:r>
         <w:t>Maquetador</w:t>
@@ -1729,7 +1705,7 @@
           <w:i/>
           <w:sz w:val="19"/>
         </w:rPr>
-        <w:t>Qué mostrar. Orden de capítulos: 12, 11, 13, 14 y 16. Tener preparada una prueba breve y ensayada. Una persona opera la aplicación real y otra supervisa la toma y el recorrido. Reservar 20 segundos de observación sin hablar dentro del bloque de demostración de 10:25 a 11:15. Si la prueba física no está preparada, explicar el recorrido con el modelo y usar los registros disponibles como evidencia, identificándolos; no anunciar un resultado que no se esté viendo.</w:t>
+        <w:t>Qué mostrar. DIAPOSITIVA 12 «Diseñar. Ensamblar. Poner a funcionar.» → DIAPOSITIVA 11 «Del cálculo a la pieza real.» → DIAPOSITIVA 13 «La precisión también se aprende.» → DIAPOSITIVA 14 «Otra tarea. Otra escala.» → DIAPOSITIVA 16 «JaqueBot» (cierre). Mostrar la construcción y la prueba supervisada. Reservar 20 segundos de observación; explicar el límite, la proyección y los aprendizajes. El gestor da paso al video a las 11:55.</w:t>
       </w:r>
     </w:p>
     <w:p>
@@ -1758,7 +1734,7 @@
             <w:u w:val="single"/>
             <w:sz w:val="19"/>
           </w:rPr>
-          <w:t>Capítulo 12</w:t>
+          <w:t>DIAPOSITIVA 12 «Diseñar. Ensamblar. Poner a funcionar.»</w:t>
         </w:r>
       </w:hyperlink>
     </w:p>
@@ -1793,7 +1769,7 @@
             <w:u w:val="single"/>
             <w:sz w:val="19"/>
           </w:rPr>
-          <w:t>Capítulo 11</w:t>
+          <w:t>DIAPOSITIVA 11 «Del cálculo a la pieza real.»</w:t>
         </w:r>
       </w:hyperlink>
     </w:p>
@@ -1828,7 +1804,7 @@
             <w:u w:val="single"/>
             <w:sz w:val="19"/>
           </w:rPr>
-          <w:t>Capítulo 13</w:t>
+          <w:t>DIAPOSITIVA 13 «La precisión también se aprende.»</w:t>
         </w:r>
       </w:hyperlink>
     </w:p>
@@ -1863,7 +1839,7 @@
             <w:u w:val="single"/>
             <w:sz w:val="19"/>
           </w:rPr>
-          <w:t>Capítulo 14</w:t>
+          <w:t>DIAPOSITIVA 14 «Otra tarea. Otra escala.»</w:t>
         </w:r>
       </w:hyperlink>
     </w:p>
@@ -1898,13 +1874,13 @@
             <w:u w:val="single"/>
             <w:sz w:val="19"/>
           </w:rPr>
-          <w:t>Capítulo 16</w:t>
+          <w:t>DIAPOSITIVA 16 «JaqueBot» (cierre)</w:t>
         </w:r>
       </w:hyperlink>
     </w:p>
     <w:p>
       <w:r>
-        <w:t>Aprendimos a ensamblar, programar y repartir tareas. También a medir antes de suponer y probar por partes para encontrar errores. Entendimos que diseño, conexiones y programa deben trabajar juntos.</w:t>
+        <w:t>Aplicamos Matemáticas y Sistemas: coordenadas, ángulos, programación y conexiones aprendidas en los cursos de Arduino. Aprendimos a cuidar la luz y las etiquetas, repartir tareas y comprobar cada parte del robot.</w:t>
       </w:r>
     </w:p>
     <w:p>
@@ -1923,8 +1899,18 @@
         <w:rPr>
           <w:sz w:val="18"/>
         </w:rPr>
-        <w:t>11:55 a 12:00   |   Gestor de proyecto</w:t>
-      </w:r>
+        <w:t xml:space="preserve">11:55 a 12:00   |   Gestor de proyecto   |   </w:t>
+      </w:r>
+      <w:hyperlink r:id="rId26">
+        <w:r>
+          <w:rPr>
+            <w:color w:val="173D5A"/>
+            <w:u w:val="single"/>
+            <w:sz w:val="19"/>
+          </w:rPr>
+          <w:t>DIAPOSITIVA 16 «JaqueBot» (cierre)</w:t>
+        </w:r>
+      </w:hyperlink>
     </w:p>
     <w:p>
       <w:r>
@@ -1944,16 +1930,12 @@
       </w:r>
     </w:p>
     <w:p>
-      <w:r>
-        <w:br w:type="page"/>
-      </w:r>
-    </w:p>
-    <w:p>
       <w:pPr>
         <w:pStyle w:val="Heading1"/>
+        <w:pageBreakBefore/>
       </w:pPr>
       <w:r>
-        <w:t>Palabras del proyecto explicadas</w:t>
+        <w:t>Estructura y movimiento explicados</w:t>
       </w:r>
     </w:p>
     <w:p>
@@ -1964,748 +1946,555 @@
         <w:rPr>
           <w:sz w:val="20"/>
         </w:rPr>
-        <w:t>Apoyo para entender y responder. No se lee como una lista durante la exposición.</w:t>
+        <w:t>Cada entrada explica qué es, para qué sirve y por qué lo usamos. Es apoyo para estudiar y responder; no se lee como una lista durante la exposición.</w:t>
       </w:r>
     </w:p>
     <w:p>
       <w:pPr>
-        <w:spacing w:after="120" w:line="254" w:lineRule="auto"/>
+        <w:spacing w:after="140" w:line="259" w:lineRule="auto"/>
       </w:pPr>
       <w:r>
         <w:rPr>
-          <w:sz w:val="20"/>
+          <w:sz w:val="21"/>
         </w:rPr>
       </w:r>
       <w:r>
         <w:rPr>
           <w:b/>
-          <w:sz w:val="20"/>
+          <w:sz w:val="21"/>
         </w:rPr>
         <w:t xml:space="preserve">Brazo robótico. </w:t>
       </w:r>
       <w:r>
         <w:rPr>
+          <w:sz w:val="21"/>
+        </w:rPr>
+        <w:t xml:space="preserve">Un mecanismo con partes móviles que pueden colocarse mediante un programa. </w:t>
+      </w:r>
+      <w:r>
+        <w:rPr>
           <w:b/>
-          <w:sz w:val="20"/>
-        </w:rPr>
-        <w:t xml:space="preserve">Qué es: </w:t>
-      </w:r>
-      <w:r>
-        <w:rPr>
-          <w:sz w:val="20"/>
-        </w:rPr>
-        <w:t xml:space="preserve">Un mecanismo con partes móviles que pueden colocarse mediante un programa. </w:t>
+          <w:sz w:val="21"/>
+        </w:rPr>
+        <w:t xml:space="preserve">Uso: </w:t>
+      </w:r>
+      <w:r>
+        <w:rPr>
+          <w:sz w:val="21"/>
+        </w:rPr>
+        <w:t xml:space="preserve">Llevar una herramienta hasta un objeto y trasladarlo. </w:t>
       </w:r>
       <w:r>
         <w:rPr>
           <w:b/>
-          <w:sz w:val="20"/>
-        </w:rPr>
-        <w:t xml:space="preserve">Para qué sirve: </w:t>
-      </w:r>
-      <w:r>
-        <w:rPr>
-          <w:sz w:val="20"/>
-        </w:rPr>
-        <w:t xml:space="preserve">Llevar una herramienta hasta un objeto y trasladarlo. </w:t>
-      </w:r>
-      <w:r>
-        <w:rPr>
-          <w:b/>
-          <w:sz w:val="20"/>
+          <w:sz w:val="21"/>
         </w:rPr>
         <w:t xml:space="preserve">Por qué se usó: </w:t>
       </w:r>
       <w:r>
         <w:rPr>
-          <w:sz w:val="20"/>
+          <w:sz w:val="21"/>
         </w:rPr>
         <w:t>Permite explorar tareas repetitivas de recoger, mover y, con adaptación, clasificar objetos.</w:t>
       </w:r>
     </w:p>
     <w:p>
       <w:pPr>
-        <w:spacing w:after="120" w:line="254" w:lineRule="auto"/>
+        <w:spacing w:after="140" w:line="259" w:lineRule="auto"/>
       </w:pPr>
       <w:r>
         <w:rPr>
-          <w:sz w:val="20"/>
+          <w:sz w:val="21"/>
         </w:rPr>
       </w:r>
       <w:r>
         <w:rPr>
           <w:b/>
-          <w:sz w:val="20"/>
+          <w:sz w:val="21"/>
         </w:rPr>
         <w:t xml:space="preserve">EduSCARA. </w:t>
       </w:r>
       <w:r>
         <w:rPr>
+          <w:sz w:val="21"/>
+        </w:rPr>
+        <w:t xml:space="preserve">Un diseño abierto de brazo robótico educativo con archivos y código publicados. </w:t>
+      </w:r>
+      <w:r>
+        <w:rPr>
           <w:b/>
-          <w:sz w:val="20"/>
-        </w:rPr>
-        <w:t xml:space="preserve">Qué es: </w:t>
-      </w:r>
-      <w:r>
-        <w:rPr>
-          <w:sz w:val="20"/>
-        </w:rPr>
-        <w:t xml:space="preserve">Un diseño abierto de brazo robótico educativo con archivos y código publicados. </w:t>
+          <w:sz w:val="21"/>
+        </w:rPr>
+        <w:t xml:space="preserve">Uso: </w:t>
+      </w:r>
+      <w:r>
+        <w:rPr>
+          <w:sz w:val="21"/>
+        </w:rPr>
+        <w:t xml:space="preserve">Servir como base de estructura y control. </w:t>
       </w:r>
       <w:r>
         <w:rPr>
           <w:b/>
-          <w:sz w:val="20"/>
-        </w:rPr>
-        <w:t xml:space="preserve">Para qué sirve: </w:t>
-      </w:r>
-      <w:r>
-        <w:rPr>
-          <w:sz w:val="20"/>
-        </w:rPr>
-        <w:t xml:space="preserve">Servir como base de estructura y control. </w:t>
-      </w:r>
-      <w:r>
-        <w:rPr>
-          <w:b/>
-          <w:sz w:val="20"/>
+          <w:sz w:val="21"/>
         </w:rPr>
         <w:t xml:space="preserve">Por qué se usó: </w:t>
       </w:r>
       <w:r>
         <w:rPr>
-          <w:sz w:val="20"/>
+          <w:sz w:val="21"/>
         </w:rPr>
         <w:t>Permite estudiar un proyecto existente y dedicar el trabajo escolar al montaje, las adaptaciones y las aplicaciones. Se reconoce a sus autores.</w:t>
       </w:r>
     </w:p>
     <w:p>
       <w:pPr>
-        <w:spacing w:after="120" w:line="254" w:lineRule="auto"/>
+        <w:spacing w:after="140" w:line="259" w:lineRule="auto"/>
       </w:pPr>
       <w:r>
         <w:rPr>
-          <w:sz w:val="20"/>
+          <w:sz w:val="21"/>
         </w:rPr>
       </w:r>
       <w:r>
         <w:rPr>
           <w:b/>
-          <w:sz w:val="20"/>
+          <w:sz w:val="21"/>
         </w:rPr>
         <w:t xml:space="preserve">Autodesk Fusion. </w:t>
       </w:r>
       <w:r>
         <w:rPr>
+          <w:sz w:val="21"/>
+        </w:rPr>
+        <w:t xml:space="preserve">Un programa de diseño de objetos en tres dimensiones. </w:t>
+      </w:r>
+      <w:r>
+        <w:rPr>
           <w:b/>
-          <w:sz w:val="20"/>
-        </w:rPr>
-        <w:t xml:space="preserve">Qué es: </w:t>
-      </w:r>
-      <w:r>
-        <w:rPr>
-          <w:sz w:val="20"/>
-        </w:rPr>
-        <w:t xml:space="preserve">Un programa de diseño de objetos en tres dimensiones. </w:t>
+          <w:sz w:val="21"/>
+        </w:rPr>
+        <w:t xml:space="preserve">Uso: </w:t>
+      </w:r>
+      <w:r>
+        <w:rPr>
+          <w:sz w:val="21"/>
+        </w:rPr>
+        <w:t xml:space="preserve">Revisar medidas y adaptar el tablero, piezas y soportes antes de fabricarlos. </w:t>
       </w:r>
       <w:r>
         <w:rPr>
           <w:b/>
-          <w:sz w:val="20"/>
-        </w:rPr>
-        <w:t xml:space="preserve">Para qué sirve: </w:t>
-      </w:r>
-      <w:r>
-        <w:rPr>
-          <w:sz w:val="20"/>
-        </w:rPr>
-        <w:t xml:space="preserve">Revisar medidas y adaptar el tablero, piezas y soportes antes de fabricarlos. </w:t>
-      </w:r>
-      <w:r>
-        <w:rPr>
-          <w:b/>
-          <w:sz w:val="20"/>
+          <w:sz w:val="21"/>
         </w:rPr>
         <w:t xml:space="preserve">Por qué se usó: </w:t>
       </w:r>
       <w:r>
         <w:rPr>
-          <w:sz w:val="20"/>
+          <w:sz w:val="21"/>
         </w:rPr>
         <w:t>Permite comprobar cómo encajan las partes y preparar las adaptaciones del proyecto.</w:t>
       </w:r>
     </w:p>
     <w:p>
       <w:pPr>
-        <w:spacing w:after="120" w:line="254" w:lineRule="auto"/>
+        <w:spacing w:after="140" w:line="259" w:lineRule="auto"/>
       </w:pPr>
       <w:r>
         <w:rPr>
-          <w:sz w:val="20"/>
+          <w:sz w:val="21"/>
         </w:rPr>
       </w:r>
       <w:r>
         <w:rPr>
           <w:b/>
-          <w:sz w:val="20"/>
+          <w:sz w:val="21"/>
         </w:rPr>
         <w:t xml:space="preserve">Impresión 3D. </w:t>
       </w:r>
       <w:r>
         <w:rPr>
+          <w:sz w:val="21"/>
+        </w:rPr>
+        <w:t xml:space="preserve">Una forma de fabricar que construye el objeto añadiendo material por capas. </w:t>
+      </w:r>
+      <w:r>
+        <w:rPr>
           <w:b/>
-          <w:sz w:val="20"/>
-        </w:rPr>
-        <w:t xml:space="preserve">Qué es: </w:t>
-      </w:r>
-      <w:r>
-        <w:rPr>
-          <w:sz w:val="20"/>
-        </w:rPr>
-        <w:t xml:space="preserve">Una forma de fabricar que construye el objeto añadiendo material por capas. </w:t>
+          <w:sz w:val="21"/>
+        </w:rPr>
+        <w:t xml:space="preserve">Uso: </w:t>
+      </w:r>
+      <w:r>
+        <w:rPr>
+          <w:sz w:val="21"/>
+        </w:rPr>
+        <w:t xml:space="preserve">Convertir archivos de diseño en piezas físicas del robot y su montaje. </w:t>
       </w:r>
       <w:r>
         <w:rPr>
           <w:b/>
-          <w:sz w:val="20"/>
-        </w:rPr>
-        <w:t xml:space="preserve">Para qué sirve: </w:t>
-      </w:r>
-      <w:r>
-        <w:rPr>
-          <w:sz w:val="20"/>
-        </w:rPr>
-        <w:t xml:space="preserve">Convertir archivos de diseño en piezas físicas del robot y su montaje. </w:t>
-      </w:r>
-      <w:r>
-        <w:rPr>
-          <w:b/>
-          <w:sz w:val="20"/>
+          <w:sz w:val="21"/>
         </w:rPr>
         <w:t xml:space="preserve">Por qué se usó: </w:t>
       </w:r>
       <w:r>
         <w:rPr>
-          <w:sz w:val="20"/>
+          <w:sz w:val="21"/>
         </w:rPr>
         <w:t>Permite producir y modificar piezas adaptadas al proyecto. En este caso se utilizó material plástico.</w:t>
       </w:r>
     </w:p>
     <w:p>
       <w:pPr>
-        <w:spacing w:after="120" w:line="254" w:lineRule="auto"/>
+        <w:spacing w:after="140" w:line="259" w:lineRule="auto"/>
       </w:pPr>
       <w:r>
         <w:rPr>
-          <w:sz w:val="20"/>
+          <w:sz w:val="21"/>
         </w:rPr>
       </w:r>
       <w:r>
         <w:rPr>
           <w:b/>
-          <w:sz w:val="20"/>
+          <w:sz w:val="21"/>
         </w:rPr>
         <w:t xml:space="preserve">Servomotor. </w:t>
       </w:r>
       <w:r>
         <w:rPr>
+          <w:sz w:val="21"/>
+        </w:rPr>
+        <w:t xml:space="preserve">Un motor que recibe una orden para alcanzar una posición determinada. </w:t>
+      </w:r>
+      <w:r>
+        <w:rPr>
           <w:b/>
-          <w:sz w:val="20"/>
-        </w:rPr>
-        <w:t xml:space="preserve">Qué es: </w:t>
-      </w:r>
-      <w:r>
-        <w:rPr>
-          <w:sz w:val="20"/>
-        </w:rPr>
-        <w:t xml:space="preserve">Un motor que recibe una orden para alcanzar una posición determinada. </w:t>
+          <w:sz w:val="21"/>
+        </w:rPr>
+        <w:t xml:space="preserve">Uso: </w:t>
+      </w:r>
+      <w:r>
+        <w:rPr>
+          <w:sz w:val="21"/>
+        </w:rPr>
+        <w:t xml:space="preserve">Mover la base, el codo o el mecanismo vertical según el montaje. </w:t>
       </w:r>
       <w:r>
         <w:rPr>
           <w:b/>
-          <w:sz w:val="20"/>
-        </w:rPr>
-        <w:t xml:space="preserve">Para qué sirve: </w:t>
-      </w:r>
-      <w:r>
-        <w:rPr>
-          <w:sz w:val="20"/>
-        </w:rPr>
-        <w:t xml:space="preserve">Mover la base, el codo o el mecanismo vertical según el montaje. </w:t>
-      </w:r>
-      <w:r>
-        <w:rPr>
-          <w:b/>
-          <w:sz w:val="20"/>
+          <w:sz w:val="21"/>
         </w:rPr>
         <w:t xml:space="preserve">Por qué se usó: </w:t>
       </w:r>
       <w:r>
         <w:rPr>
-          <w:sz w:val="20"/>
+          <w:sz w:val="21"/>
         </w:rPr>
         <w:t>El robot necesita dirigir la herramienta a lugares concretos, no mantener un giro continuo. La orden por sí sola no prueba precisión física.</w:t>
       </w:r>
     </w:p>
     <w:p>
       <w:pPr>
-        <w:spacing w:after="120" w:line="254" w:lineRule="auto"/>
+        <w:spacing w:after="140" w:line="259" w:lineRule="auto"/>
       </w:pPr>
       <w:r>
         <w:rPr>
-          <w:sz w:val="20"/>
+          <w:sz w:val="21"/>
         </w:rPr>
       </w:r>
       <w:r>
         <w:rPr>
           <w:b/>
-          <w:sz w:val="20"/>
+          <w:sz w:val="21"/>
         </w:rPr>
         <w:t xml:space="preserve">Potenciómetro. </w:t>
       </w:r>
       <w:r>
         <w:rPr>
+          <w:sz w:val="21"/>
+        </w:rPr>
+        <w:t xml:space="preserve">Un componente cuya señal eléctrica cambia cuando gira. </w:t>
+      </w:r>
+      <w:r>
+        <w:rPr>
           <w:b/>
-          <w:sz w:val="20"/>
-        </w:rPr>
-        <w:t xml:space="preserve">Qué es: </w:t>
-      </w:r>
-      <w:r>
-        <w:rPr>
-          <w:sz w:val="20"/>
-        </w:rPr>
-        <w:t xml:space="preserve">Un componente cuya señal eléctrica cambia cuando gira. </w:t>
+          <w:sz w:val="21"/>
+        </w:rPr>
+        <w:t xml:space="preserve">Uso: </w:t>
+      </w:r>
+      <w:r>
+        <w:rPr>
+          <w:sz w:val="21"/>
+        </w:rPr>
+        <w:t xml:space="preserve">Usarse como sensor para estimar el ángulo de la base o del codo. </w:t>
       </w:r>
       <w:r>
         <w:rPr>
           <w:b/>
-          <w:sz w:val="20"/>
-        </w:rPr>
-        <w:t xml:space="preserve">Para qué sirve: </w:t>
-      </w:r>
-      <w:r>
-        <w:rPr>
-          <w:sz w:val="20"/>
-        </w:rPr>
-        <w:t xml:space="preserve">Usarse como sensor para estimar el ángulo de la base o del codo. </w:t>
-      </w:r>
-      <w:r>
-        <w:rPr>
-          <w:b/>
-          <w:sz w:val="20"/>
+          <w:sz w:val="21"/>
         </w:rPr>
         <w:t xml:space="preserve">Por qué se usó: </w:t>
       </w:r>
       <w:r>
         <w:rPr>
-          <w:sz w:val="20"/>
+          <w:sz w:val="21"/>
         </w:rPr>
         <w:t>Permite comparar dónde se esperaba llegar con lo que indica el montaje.</w:t>
       </w:r>
     </w:p>
     <w:p>
       <w:pPr>
-        <w:spacing w:after="120" w:line="254" w:lineRule="auto"/>
+        <w:spacing w:after="140" w:line="259" w:lineRule="auto"/>
       </w:pPr>
       <w:r>
         <w:rPr>
-          <w:sz w:val="20"/>
+          <w:sz w:val="21"/>
         </w:rPr>
       </w:r>
       <w:r>
         <w:rPr>
           <w:b/>
-          <w:sz w:val="20"/>
+          <w:sz w:val="21"/>
         </w:rPr>
         <w:t xml:space="preserve">Sensor. </w:t>
       </w:r>
       <w:r>
         <w:rPr>
+          <w:sz w:val="21"/>
+        </w:rPr>
+        <w:t xml:space="preserve">Un elemento que convierte una característica física, como posición o luz, en información. </w:t>
+      </w:r>
+      <w:r>
+        <w:rPr>
           <w:b/>
-          <w:sz w:val="20"/>
-        </w:rPr>
-        <w:t xml:space="preserve">Qué es: </w:t>
-      </w:r>
-      <w:r>
-        <w:rPr>
-          <w:sz w:val="20"/>
-        </w:rPr>
-        <w:t xml:space="preserve">Un elemento que convierte una característica física, como posición o luz, en información. </w:t>
+          <w:sz w:val="21"/>
+        </w:rPr>
+        <w:t xml:space="preserve">Uso: </w:t>
+      </w:r>
+      <w:r>
+        <w:rPr>
+          <w:sz w:val="21"/>
+        </w:rPr>
+        <w:t xml:space="preserve">Aportar datos al programa. </w:t>
       </w:r>
       <w:r>
         <w:rPr>
           <w:b/>
-          <w:sz w:val="20"/>
-        </w:rPr>
-        <w:t xml:space="preserve">Para qué sirve: </w:t>
-      </w:r>
-      <w:r>
-        <w:rPr>
-          <w:sz w:val="20"/>
-        </w:rPr>
-        <w:t xml:space="preserve">Aportar datos al programa. </w:t>
-      </w:r>
-      <w:r>
-        <w:rPr>
-          <w:b/>
-          <w:sz w:val="20"/>
+          <w:sz w:val="21"/>
         </w:rPr>
         <w:t xml:space="preserve">Por qué se usó: </w:t>
       </w:r>
       <w:r>
         <w:rPr>
-          <w:sz w:val="20"/>
+          <w:sz w:val="21"/>
         </w:rPr>
         <w:t>Ayuda a comprobar lo que ocurre. En JaqueBot no todos los estados se miden: faltan sensores directos de altura y agarre.</w:t>
       </w:r>
     </w:p>
     <w:p>
       <w:pPr>
-        <w:spacing w:after="120" w:line="254" w:lineRule="auto"/>
+        <w:spacing w:after="140" w:line="259" w:lineRule="auto"/>
       </w:pPr>
       <w:r>
         <w:rPr>
-          <w:sz w:val="20"/>
+          <w:sz w:val="21"/>
         </w:rPr>
       </w:r>
       <w:r>
         <w:rPr>
           <w:b/>
-          <w:sz w:val="20"/>
+          <w:sz w:val="21"/>
         </w:rPr>
         <w:t xml:space="preserve">Eje Z. </w:t>
       </w:r>
       <w:r>
         <w:rPr>
+          <w:sz w:val="21"/>
+        </w:rPr>
+        <w:t xml:space="preserve">El nombre del movimiento vertical del extremo. </w:t>
+      </w:r>
+      <w:r>
+        <w:rPr>
           <w:b/>
-          <w:sz w:val="20"/>
-        </w:rPr>
-        <w:t xml:space="preserve">Qué es: </w:t>
-      </w:r>
-      <w:r>
-        <w:rPr>
-          <w:sz w:val="20"/>
-        </w:rPr>
-        <w:t xml:space="preserve">El nombre del movimiento vertical del extremo. </w:t>
+          <w:sz w:val="21"/>
+        </w:rPr>
+        <w:t xml:space="preserve">Uso: </w:t>
+      </w:r>
+      <w:r>
+        <w:rPr>
+          <w:sz w:val="21"/>
+        </w:rPr>
+        <w:t xml:space="preserve">Subir y bajar la herramienta al recoger o dejar una pieza. </w:t>
       </w:r>
       <w:r>
         <w:rPr>
           <w:b/>
-          <w:sz w:val="20"/>
-        </w:rPr>
-        <w:t xml:space="preserve">Para qué sirve: </w:t>
-      </w:r>
-      <w:r>
-        <w:rPr>
-          <w:sz w:val="20"/>
-        </w:rPr>
-        <w:t xml:space="preserve">Subir y bajar la herramienta al recoger o dejar una pieza. </w:t>
-      </w:r>
-      <w:r>
-        <w:rPr>
-          <w:b/>
-          <w:sz w:val="20"/>
+          <w:sz w:val="21"/>
         </w:rPr>
         <w:t xml:space="preserve">Por qué se usó: </w:t>
       </w:r>
       <w:r>
         <w:rPr>
-          <w:sz w:val="20"/>
+          <w:sz w:val="21"/>
         </w:rPr>
         <w:t>El brazo debe pasar sobre las otras piezas y acercarse al objeto solo cuando corresponde.</w:t>
       </w:r>
     </w:p>
     <w:p>
       <w:pPr>
-        <w:spacing w:after="120" w:line="254" w:lineRule="auto"/>
+        <w:spacing w:after="140" w:line="259" w:lineRule="auto"/>
       </w:pPr>
       <w:r>
         <w:rPr>
-          <w:sz w:val="20"/>
+          <w:sz w:val="21"/>
         </w:rPr>
       </w:r>
       <w:r>
         <w:rPr>
           <w:b/>
-          <w:sz w:val="20"/>
+          <w:sz w:val="21"/>
         </w:rPr>
         <w:t xml:space="preserve">Electroimán. </w:t>
       </w:r>
       <w:r>
         <w:rPr>
+          <w:sz w:val="21"/>
+        </w:rPr>
+        <w:t xml:space="preserve">Un dispositivo que produce atracción magnética cuando recibe electricidad. </w:t>
+      </w:r>
+      <w:r>
+        <w:rPr>
           <w:b/>
-          <w:sz w:val="20"/>
-        </w:rPr>
-        <w:t xml:space="preserve">Qué es: </w:t>
-      </w:r>
-      <w:r>
-        <w:rPr>
-          <w:sz w:val="20"/>
-        </w:rPr>
-        <w:t xml:space="preserve">Un dispositivo que produce atracción magnética cuando recibe electricidad. </w:t>
+          <w:sz w:val="21"/>
+        </w:rPr>
+        <w:t xml:space="preserve">Uso: </w:t>
+      </w:r>
+      <w:r>
+        <w:rPr>
+          <w:sz w:val="21"/>
+        </w:rPr>
+        <w:t xml:space="preserve">Tomar y liberar la parte metálica de una pieza. </w:t>
       </w:r>
       <w:r>
         <w:rPr>
           <w:b/>
-          <w:sz w:val="20"/>
-        </w:rPr>
-        <w:t xml:space="preserve">Para qué sirve: </w:t>
-      </w:r>
-      <w:r>
-        <w:rPr>
-          <w:sz w:val="20"/>
-        </w:rPr>
-        <w:t xml:space="preserve">Tomar y liberar la parte metálica de una pieza. </w:t>
-      </w:r>
-      <w:r>
-        <w:rPr>
-          <w:b/>
-          <w:sz w:val="20"/>
+          <w:sz w:val="21"/>
         </w:rPr>
         <w:t xml:space="preserve">Por qué se usó: </w:t>
       </w:r>
       <w:r>
         <w:rPr>
-          <w:sz w:val="20"/>
+          <w:sz w:val="21"/>
         </w:rPr>
         <w:t>Permite controlar la sujeción desde el programa, encendiéndolo o apagándolo. No atrae cualquier material ni garantiza recoger una sola pieza.</w:t>
       </w:r>
     </w:p>
     <w:p>
       <w:pPr>
-        <w:spacing w:after="120" w:line="254" w:lineRule="auto"/>
+        <w:spacing w:after="140" w:line="259" w:lineRule="auto"/>
       </w:pPr>
       <w:r>
         <w:rPr>
-          <w:sz w:val="20"/>
+          <w:sz w:val="21"/>
         </w:rPr>
       </w:r>
       <w:r>
         <w:rPr>
           <w:b/>
-          <w:sz w:val="20"/>
-        </w:rPr>
-        <w:t xml:space="preserve">Raspberry Pi. </w:t>
+          <w:sz w:val="21"/>
+        </w:rPr>
+        <w:t xml:space="preserve">Coordenadas X e Y. </w:t>
+      </w:r>
+      <w:r>
+        <w:rPr>
+          <w:sz w:val="21"/>
+        </w:rPr>
+        <w:t xml:space="preserve">Dos valores que ubican un lugar sobre un plano. </w:t>
       </w:r>
       <w:r>
         <w:rPr>
           <w:b/>
-          <w:sz w:val="20"/>
-        </w:rPr>
-        <w:t xml:space="preserve">Qué es: </w:t>
-      </w:r>
-      <w:r>
-        <w:rPr>
-          <w:sz w:val="20"/>
-        </w:rPr>
-        <w:t xml:space="preserve">Una computadora pequeña montada en una placa. </w:t>
+          <w:sz w:val="21"/>
+        </w:rPr>
+        <w:t xml:space="preserve">Uso: </w:t>
+      </w:r>
+      <w:r>
+        <w:rPr>
+          <w:sz w:val="21"/>
+        </w:rPr>
+        <w:t xml:space="preserve">Describir dónde está el extremo del brazo sobre el tablero. </w:t>
       </w:r>
       <w:r>
         <w:rPr>
           <w:b/>
-          <w:sz w:val="20"/>
-        </w:rPr>
-        <w:t xml:space="preserve">Para qué sirve: </w:t>
-      </w:r>
-      <w:r>
-        <w:rPr>
-          <w:sz w:val="20"/>
-        </w:rPr>
-        <w:t xml:space="preserve">Ejecutar las aplicaciones, procesar las imágenes y coordinar la tarea. </w:t>
-      </w:r>
-      <w:r>
-        <w:rPr>
-          <w:b/>
-          <w:sz w:val="20"/>
+          <w:sz w:val="21"/>
         </w:rPr>
         <w:t xml:space="preserve">Por qué se usó: </w:t>
       </w:r>
       <w:r>
         <w:rPr>
-          <w:sz w:val="20"/>
-        </w:rPr>
-        <w:t>Reúne en el prototipo la interfaz, el análisis del tablero y el cálculo de jugadas.</w:t>
+          <w:sz w:val="21"/>
+        </w:rPr>
+        <w:t>Permiten relacionar una casilla con un destino físico, usando las medidas y la geometría del brazo.</w:t>
       </w:r>
     </w:p>
     <w:p>
       <w:pPr>
-        <w:spacing w:after="120" w:line="254" w:lineRule="auto"/>
+        <w:spacing w:after="140" w:line="259" w:lineRule="auto"/>
       </w:pPr>
       <w:r>
         <w:rPr>
-          <w:sz w:val="20"/>
+          <w:sz w:val="21"/>
         </w:rPr>
       </w:r>
       <w:r>
         <w:rPr>
           <w:b/>
-          <w:sz w:val="20"/>
-        </w:rPr>
-        <w:t xml:space="preserve">Raspberry Pi AI Camera / sensor Sony. </w:t>
+          <w:sz w:val="21"/>
+        </w:rPr>
+        <w:t xml:space="preserve">Grados y ángulo. </w:t>
+      </w:r>
+      <w:r>
+        <w:rPr>
+          <w:sz w:val="21"/>
+        </w:rPr>
+        <w:t xml:space="preserve">Una forma de medir cuánto gira una línea o una articulación. </w:t>
       </w:r>
       <w:r>
         <w:rPr>
           <w:b/>
-          <w:sz w:val="20"/>
-        </w:rPr>
-        <w:t xml:space="preserve">Qué es: </w:t>
-      </w:r>
-      <w:r>
-        <w:rPr>
-          <w:sz w:val="20"/>
-        </w:rPr>
-        <w:t xml:space="preserve">El módulo de cámara utilizado para obtener las imágenes; su sensor es Sony IMX500. </w:t>
+          <w:sz w:val="21"/>
+        </w:rPr>
+        <w:t xml:space="preserve">Uso: </w:t>
+      </w:r>
+      <w:r>
+        <w:rPr>
+          <w:sz w:val="21"/>
+        </w:rPr>
+        <w:t xml:space="preserve">Expresar el giro de la base y del codo. </w:t>
       </w:r>
       <w:r>
         <w:rPr>
           <w:b/>
-          <w:sz w:val="20"/>
-        </w:rPr>
-        <w:t xml:space="preserve">Para qué sirve: </w:t>
-      </w:r>
-      <w:r>
-        <w:rPr>
-          <w:sz w:val="20"/>
-        </w:rPr>
-        <w:t xml:space="preserve">Observar el tablero y las etiquetas de las piezas. </w:t>
-      </w:r>
-      <w:r>
-        <w:rPr>
-          <w:b/>
-          <w:sz w:val="20"/>
+          <w:sz w:val="21"/>
         </w:rPr>
         <w:t xml:space="preserve">Por qué se usó: </w:t>
       </w:r>
       <w:r>
         <w:rPr>
-          <w:sz w:val="20"/>
-        </w:rPr>
-        <w:t>Proporciona las imágenes que analiza la Raspberry. El nombre AI Camera no significa que en esta aplicación su sensor elija jugadas ni que haga por sí mismo el reconocimiento ArUco.</w:t>
-      </w:r>
-    </w:p>
-    <w:p>
-      <w:pPr>
-        <w:spacing w:after="120" w:line="254" w:lineRule="auto"/>
-      </w:pPr>
-      <w:r>
-        <w:rPr>
-          <w:sz w:val="20"/>
-        </w:rPr>
-      </w:r>
-      <w:r>
-        <w:rPr>
-          <w:b/>
-          <w:sz w:val="20"/>
-        </w:rPr>
-        <w:t xml:space="preserve">ArUco. </w:t>
-      </w:r>
-      <w:r>
-        <w:rPr>
-          <w:b/>
-          <w:sz w:val="20"/>
-        </w:rPr>
-        <w:t xml:space="preserve">Qué es: </w:t>
-      </w:r>
-      <w:r>
-        <w:rPr>
-          <w:sz w:val="20"/>
-        </w:rPr>
-        <w:t xml:space="preserve">Una familia de etiquetas cuadradas con dibujos que representan identidades. </w:t>
-      </w:r>
-      <w:r>
-        <w:rPr>
-          <w:b/>
-          <w:sz w:val="20"/>
-        </w:rPr>
-        <w:t xml:space="preserve">Para qué sirve: </w:t>
-      </w:r>
-      <w:r>
-        <w:rPr>
-          <w:sz w:val="20"/>
-        </w:rPr>
-        <w:t xml:space="preserve">Distinguir piezas y ubicar referencias del tablero en la imagen. </w:t>
-      </w:r>
-      <w:r>
-        <w:rPr>
-          <w:b/>
-          <w:sz w:val="20"/>
-        </w:rPr>
-        <w:t xml:space="preserve">Por qué se usó: </w:t>
-      </w:r>
-      <w:r>
-        <w:rPr>
-          <w:sz w:val="20"/>
-        </w:rPr>
-        <w:t>Permite reconocer identidades definidas en lugar de depender solo de la apariencia o del color de una pieza.</w:t>
-      </w:r>
-    </w:p>
-    <w:p>
-      <w:pPr>
-        <w:spacing w:after="120" w:line="254" w:lineRule="auto"/>
-      </w:pPr>
-      <w:r>
-        <w:rPr>
-          <w:sz w:val="20"/>
-        </w:rPr>
-      </w:r>
-      <w:r>
-        <w:rPr>
-          <w:b/>
-          <w:sz w:val="20"/>
-        </w:rPr>
-        <w:t xml:space="preserve">OpenCV. </w:t>
-      </w:r>
-      <w:r>
-        <w:rPr>
-          <w:b/>
-          <w:sz w:val="20"/>
-        </w:rPr>
-        <w:t xml:space="preserve">Qué es: </w:t>
-      </w:r>
-      <w:r>
-        <w:rPr>
-          <w:sz w:val="20"/>
-        </w:rPr>
-        <w:t xml:space="preserve">Un conjunto de herramientas de programación para trabajar con imágenes. </w:t>
-      </w:r>
-      <w:r>
-        <w:rPr>
-          <w:b/>
-          <w:sz w:val="20"/>
-        </w:rPr>
-        <w:t xml:space="preserve">Para qué sirve: </w:t>
-      </w:r>
-      <w:r>
-        <w:rPr>
-          <w:sz w:val="20"/>
-        </w:rPr>
-        <w:t xml:space="preserve">Reconocer las etiquetas y situarlas en el tablero. </w:t>
-      </w:r>
-      <w:r>
-        <w:rPr>
-          <w:b/>
-          <w:sz w:val="20"/>
-        </w:rPr>
-        <w:t xml:space="preserve">Por qué se usó: </w:t>
-      </w:r>
-      <w:r>
-        <w:rPr>
-          <w:sz w:val="20"/>
-        </w:rPr>
-        <w:t>Aporta funciones de visión ya desarrolladas que el equipo integra en su aplicación.</w:t>
-      </w:r>
-    </w:p>
-    <w:p>
-      <w:r>
-        <w:br w:type="page"/>
+          <w:sz w:val="21"/>
+        </w:rPr>
+        <w:t>Permiten relacionar el movimiento de los motores con el destino. Noventa grados equivale a un cuarto de vuelta como ejemplo matemático, no es una instrucción de operación ni una afirmación sobre el alcance del robot.</w:t>
       </w:r>
     </w:p>
     <w:p>
       <w:pPr>
         <w:pStyle w:val="Heading1"/>
+        <w:pageBreakBefore/>
       </w:pPr>
       <w:r>
-        <w:t>Programas y conexiones explicados</w:t>
+        <w:t>Visión conexiones y control explicados</w:t>
       </w:r>
     </w:p>
     <w:p>
@@ -2716,745 +2505,964 @@
         <w:rPr>
           <w:sz w:val="20"/>
         </w:rPr>
-        <w:t>Apoyo para entender y responder. No se lee como una lista durante la exposición.</w:t>
+        <w:t>Cada entrada explica qué es, para qué sirve y por qué lo usamos. Es apoyo para estudiar y responder; no se lee como una lista durante la exposición.</w:t>
       </w:r>
     </w:p>
     <w:p>
       <w:pPr>
-        <w:spacing w:after="120" w:line="254" w:lineRule="auto"/>
+        <w:spacing w:after="140" w:line="259" w:lineRule="auto"/>
       </w:pPr>
       <w:r>
         <w:rPr>
-          <w:sz w:val="20"/>
+          <w:sz w:val="21"/>
         </w:rPr>
       </w:r>
       <w:r>
         <w:rPr>
           <w:b/>
-          <w:sz w:val="20"/>
-        </w:rPr>
-        <w:t xml:space="preserve">Calibrar. </w:t>
+          <w:sz w:val="21"/>
+        </w:rPr>
+        <w:t xml:space="preserve">Raspberry Pi. </w:t>
+      </w:r>
+      <w:r>
+        <w:rPr>
+          <w:sz w:val="21"/>
+        </w:rPr>
+        <w:t xml:space="preserve">Una computadora pequeña montada en una placa. </w:t>
       </w:r>
       <w:r>
         <w:rPr>
           <w:b/>
-          <w:sz w:val="20"/>
-        </w:rPr>
-        <w:t xml:space="preserve">Qué es: </w:t>
-      </w:r>
-      <w:r>
-        <w:rPr>
-          <w:sz w:val="20"/>
-        </w:rPr>
-        <w:t xml:space="preserve">Medir y guardar referencias para relacionar el programa con el montaje real. </w:t>
+          <w:sz w:val="21"/>
+        </w:rPr>
+        <w:t xml:space="preserve">Uso: </w:t>
+      </w:r>
+      <w:r>
+        <w:rPr>
+          <w:sz w:val="21"/>
+        </w:rPr>
+        <w:t xml:space="preserve">Ejecutar las aplicaciones, procesar las imágenes y coordinar la tarea. </w:t>
       </w:r>
       <w:r>
         <w:rPr>
           <w:b/>
-          <w:sz w:val="20"/>
-        </w:rPr>
-        <w:t xml:space="preserve">Para qué sirve: </w:t>
-      </w:r>
-      <w:r>
-        <w:rPr>
-          <w:sz w:val="20"/>
-        </w:rPr>
-        <w:t xml:space="preserve">Saber dónde está cada casilla y qué movimiento corresponde. </w:t>
-      </w:r>
-      <w:r>
-        <w:rPr>
-          <w:b/>
-          <w:sz w:val="20"/>
+          <w:sz w:val="21"/>
         </w:rPr>
         <w:t xml:space="preserve">Por qué se usó: </w:t>
       </w:r>
       <w:r>
         <w:rPr>
-          <w:sz w:val="20"/>
-        </w:rPr>
-        <w:t>Una imagen o un número no coinciden automáticamente con una posición física. Cámara, tablero y motores requieren sus propias comprobaciones.</w:t>
+          <w:sz w:val="21"/>
+        </w:rPr>
+        <w:t>Reúne en el prototipo la interfaz, el análisis del tablero y el cálculo de jugadas.</w:t>
       </w:r>
     </w:p>
     <w:p>
       <w:pPr>
-        <w:spacing w:after="120" w:line="254" w:lineRule="auto"/>
+        <w:spacing w:after="140" w:line="259" w:lineRule="auto"/>
       </w:pPr>
       <w:r>
         <w:rPr>
-          <w:sz w:val="20"/>
+          <w:sz w:val="21"/>
         </w:rPr>
       </w:r>
       <w:r>
         <w:rPr>
           <w:b/>
-          <w:sz w:val="20"/>
-        </w:rPr>
-        <w:t xml:space="preserve">NUCLEO / STM32. </w:t>
+          <w:sz w:val="21"/>
+        </w:rPr>
+        <w:t xml:space="preserve">Raspberry Pi AI Camera / sensor Sony. </w:t>
+      </w:r>
+      <w:r>
+        <w:rPr>
+          <w:sz w:val="21"/>
+        </w:rPr>
+        <w:t xml:space="preserve">El módulo de cámara utilizado para obtener las imágenes; su sensor es Sony IMX500. </w:t>
       </w:r>
       <w:r>
         <w:rPr>
           <w:b/>
-          <w:sz w:val="20"/>
-        </w:rPr>
-        <w:t xml:space="preserve">Qué es: </w:t>
-      </w:r>
-      <w:r>
-        <w:rPr>
-          <w:sz w:val="20"/>
-        </w:rPr>
-        <w:t xml:space="preserve">NUCLEO es la placa utilizada; STM32 es el circuito programable que contiene. </w:t>
+          <w:sz w:val="21"/>
+        </w:rPr>
+        <w:t xml:space="preserve">Uso: </w:t>
+      </w:r>
+      <w:r>
+        <w:rPr>
+          <w:sz w:val="21"/>
+        </w:rPr>
+        <w:t xml:space="preserve">Observar el tablero y las etiquetas de las piezas. </w:t>
       </w:r>
       <w:r>
         <w:rPr>
           <w:b/>
-          <w:sz w:val="20"/>
-        </w:rPr>
-        <w:t xml:space="preserve">Para qué sirve: </w:t>
-      </w:r>
-      <w:r>
-        <w:rPr>
-          <w:sz w:val="20"/>
-        </w:rPr>
-        <w:t xml:space="preserve">Recibir órdenes por USB, producir señales para el movimiento y consultar los sensores. </w:t>
-      </w:r>
-      <w:r>
-        <w:rPr>
-          <w:b/>
-          <w:sz w:val="20"/>
+          <w:sz w:val="21"/>
         </w:rPr>
         <w:t xml:space="preserve">Por qué se usó: </w:t>
       </w:r>
       <w:r>
         <w:rPr>
-          <w:sz w:val="20"/>
-        </w:rPr>
-        <w:t>Forma parte del control original de EduSCARA y permite que la Raspberry se concentre en coordinar las aplicaciones.</w:t>
+          <w:sz w:val="21"/>
+        </w:rPr>
+        <w:t>Proporciona las imágenes que analiza la Raspberry. El nombre AI Camera no significa que en esta aplicación su sensor elija jugadas ni que haga por sí mismo el reconocimiento ArUco.</w:t>
       </w:r>
     </w:p>
     <w:p>
       <w:pPr>
-        <w:spacing w:after="120" w:line="254" w:lineRule="auto"/>
+        <w:spacing w:after="140" w:line="259" w:lineRule="auto"/>
       </w:pPr>
       <w:r>
         <w:rPr>
-          <w:sz w:val="20"/>
+          <w:sz w:val="21"/>
         </w:rPr>
       </w:r>
       <w:r>
         <w:rPr>
           <w:b/>
-          <w:sz w:val="20"/>
-        </w:rPr>
-        <w:t xml:space="preserve">USB. </w:t>
+          <w:sz w:val="21"/>
+        </w:rPr>
+        <w:t xml:space="preserve">ArUco. </w:t>
+      </w:r>
+      <w:r>
+        <w:rPr>
+          <w:sz w:val="21"/>
+        </w:rPr>
+        <w:t xml:space="preserve">Una familia de etiquetas cuadradas con dibujos que representan identidades. </w:t>
       </w:r>
       <w:r>
         <w:rPr>
           <w:b/>
-          <w:sz w:val="20"/>
-        </w:rPr>
-        <w:t xml:space="preserve">Qué es: </w:t>
-      </w:r>
-      <w:r>
-        <w:rPr>
-          <w:sz w:val="20"/>
-        </w:rPr>
-        <w:t xml:space="preserve">Una conexión por cable para intercambiar datos. </w:t>
+          <w:sz w:val="21"/>
+        </w:rPr>
+        <w:t xml:space="preserve">Uso: </w:t>
+      </w:r>
+      <w:r>
+        <w:rPr>
+          <w:sz w:val="21"/>
+        </w:rPr>
+        <w:t xml:space="preserve">Distinguir piezas y ubicar referencias del tablero en la imagen. </w:t>
       </w:r>
       <w:r>
         <w:rPr>
           <w:b/>
-          <w:sz w:val="20"/>
-        </w:rPr>
-        <w:t xml:space="preserve">Para qué sirve: </w:t>
-      </w:r>
-      <w:r>
-        <w:rPr>
-          <w:sz w:val="20"/>
-        </w:rPr>
-        <w:t xml:space="preserve">Comunicar las órdenes y respuestas entre la Raspberry y la placa de control. </w:t>
-      </w:r>
-      <w:r>
-        <w:rPr>
-          <w:b/>
-          <w:sz w:val="20"/>
+          <w:sz w:val="21"/>
         </w:rPr>
         <w:t xml:space="preserve">Por qué se usó: </w:t>
       </w:r>
       <w:r>
         <w:rPr>
-          <w:sz w:val="20"/>
-        </w:rPr>
-        <w:t>Es el enlace que utiliza el control existente. Solo una aplicación lo controla a la vez.</w:t>
+          <w:sz w:val="21"/>
+        </w:rPr>
+        <w:t>Permite reconocer identidades definidas en lugar de depender solo de la apariencia o del color de una pieza.</w:t>
       </w:r>
     </w:p>
     <w:p>
       <w:pPr>
-        <w:spacing w:after="120" w:line="254" w:lineRule="auto"/>
+        <w:spacing w:after="140" w:line="259" w:lineRule="auto"/>
       </w:pPr>
       <w:r>
         <w:rPr>
-          <w:sz w:val="20"/>
+          <w:sz w:val="21"/>
         </w:rPr>
       </w:r>
       <w:r>
         <w:rPr>
           <w:b/>
-          <w:sz w:val="20"/>
-        </w:rPr>
-        <w:t xml:space="preserve">Fuente de alimentación. </w:t>
+          <w:sz w:val="21"/>
+        </w:rPr>
+        <w:t xml:space="preserve">OpenCV. </w:t>
+      </w:r>
+      <w:r>
+        <w:rPr>
+          <w:sz w:val="21"/>
+        </w:rPr>
+        <w:t xml:space="preserve">Un conjunto de herramientas de programación para trabajar con imágenes. </w:t>
       </w:r>
       <w:r>
         <w:rPr>
           <w:b/>
-          <w:sz w:val="20"/>
-        </w:rPr>
-        <w:t xml:space="preserve">Qué es: </w:t>
-      </w:r>
-      <w:r>
-        <w:rPr>
-          <w:sz w:val="20"/>
-        </w:rPr>
-        <w:t xml:space="preserve">Un dispositivo que entrega electricidad con las características que necesita un equipo. </w:t>
+          <w:sz w:val="21"/>
+        </w:rPr>
+        <w:t xml:space="preserve">Uso: </w:t>
+      </w:r>
+      <w:r>
+        <w:rPr>
+          <w:sz w:val="21"/>
+        </w:rPr>
+        <w:t xml:space="preserve">Reconocer las etiquetas y situarlas en el tablero. </w:t>
       </w:r>
       <w:r>
         <w:rPr>
           <w:b/>
-          <w:sz w:val="20"/>
-        </w:rPr>
-        <w:t xml:space="preserve">Para qué sirve: </w:t>
-      </w:r>
-      <w:r>
-        <w:rPr>
-          <w:sz w:val="20"/>
-        </w:rPr>
-        <w:t xml:space="preserve">Alimentar computadora, motores o electroimán según el circuito. </w:t>
-      </w:r>
-      <w:r>
-        <w:rPr>
-          <w:b/>
-          <w:sz w:val="20"/>
+          <w:sz w:val="21"/>
         </w:rPr>
         <w:t xml:space="preserve">Por qué se usó: </w:t>
       </w:r>
       <w:r>
         <w:rPr>
-          <w:sz w:val="20"/>
-        </w:rPr>
-        <w:t>Esos elementos no se alimentan todos de la misma forma; una salida de control no debe suministrar directamente toda la corriente del imán.</w:t>
+          <w:sz w:val="21"/>
+        </w:rPr>
+        <w:t>Aporta funciones de visión ya desarrolladas que el equipo integra en su aplicación.</w:t>
       </w:r>
     </w:p>
     <w:p>
       <w:pPr>
-        <w:spacing w:after="120" w:line="254" w:lineRule="auto"/>
+        <w:spacing w:after="140" w:line="259" w:lineRule="auto"/>
       </w:pPr>
       <w:r>
         <w:rPr>
-          <w:sz w:val="20"/>
+          <w:sz w:val="21"/>
         </w:rPr>
       </w:r>
       <w:r>
         <w:rPr>
           <w:b/>
-          <w:sz w:val="20"/>
-        </w:rPr>
-        <w:t xml:space="preserve">MOSFET / módulo de potencia. </w:t>
+          <w:sz w:val="21"/>
+        </w:rPr>
+        <w:t xml:space="preserve">Visión artificial. </w:t>
+      </w:r>
+      <w:r>
+        <w:rPr>
+          <w:sz w:val="21"/>
+        </w:rPr>
+        <w:t xml:space="preserve">Programas que extraen información de una imagen. </w:t>
       </w:r>
       <w:r>
         <w:rPr>
           <w:b/>
-          <w:sz w:val="20"/>
-        </w:rPr>
-        <w:t xml:space="preserve">Qué es: </w:t>
-      </w:r>
-      <w:r>
-        <w:rPr>
-          <w:sz w:val="20"/>
-        </w:rPr>
-        <w:t xml:space="preserve">Un interruptor electrónico controlado por una señal pequeña. </w:t>
+          <w:sz w:val="21"/>
+        </w:rPr>
+        <w:t xml:space="preserve">Uso: </w:t>
+      </w:r>
+      <w:r>
+        <w:rPr>
+          <w:sz w:val="21"/>
+        </w:rPr>
+        <w:t xml:space="preserve">Reconocer las etiquetas de las piezas y relacionarlas con las casillas. </w:t>
       </w:r>
       <w:r>
         <w:rPr>
           <w:b/>
-          <w:sz w:val="20"/>
-        </w:rPr>
-        <w:t xml:space="preserve">Para qué sirve: </w:t>
-      </w:r>
-      <w:r>
-        <w:rPr>
-          <w:sz w:val="20"/>
-        </w:rPr>
-        <w:t xml:space="preserve">Permitir o cortar la corriente que alimenta el electroimán. </w:t>
-      </w:r>
-      <w:r>
-        <w:rPr>
-          <w:b/>
-          <w:sz w:val="20"/>
+          <w:sz w:val="21"/>
         </w:rPr>
         <w:t xml:space="preserve">Por qué se usó: </w:t>
       </w:r>
       <w:r>
         <w:rPr>
-          <w:sz w:val="20"/>
-        </w:rPr>
-        <w:t>La placa da la orden y el módulo maneja la corriente del dispositivo. Las protecciones concretas se describen únicamente según el circuito instalado y comprobado.</w:t>
+          <w:sz w:val="21"/>
+        </w:rPr>
+        <w:t>Conecta lo que observa la cámara con los datos que necesita la aplicación; en este proyecto se usa OpenCV, sin suponer que toda cámara entiende imágenes por sí sola.</w:t>
       </w:r>
     </w:p>
     <w:p>
       <w:pPr>
-        <w:spacing w:after="120" w:line="254" w:lineRule="auto"/>
+        <w:spacing w:after="140" w:line="259" w:lineRule="auto"/>
       </w:pPr>
       <w:r>
         <w:rPr>
-          <w:sz w:val="20"/>
+          <w:sz w:val="21"/>
         </w:rPr>
       </w:r>
       <w:r>
         <w:rPr>
           <w:b/>
-          <w:sz w:val="20"/>
-        </w:rPr>
-        <w:t xml:space="preserve">Aplicación manual. </w:t>
+          <w:sz w:val="21"/>
+        </w:rPr>
+        <w:t xml:space="preserve">Calibrar. </w:t>
+      </w:r>
+      <w:r>
+        <w:rPr>
+          <w:sz w:val="21"/>
+        </w:rPr>
+        <w:t xml:space="preserve">Medir y guardar referencias para relacionar el programa con el montaje real. </w:t>
       </w:r>
       <w:r>
         <w:rPr>
           <w:b/>
-          <w:sz w:val="20"/>
-        </w:rPr>
-        <w:t xml:space="preserve">Qué es: </w:t>
-      </w:r>
-      <w:r>
-        <w:rPr>
-          <w:sz w:val="20"/>
-        </w:rPr>
-        <w:t xml:space="preserve">La pantalla con botones para controlar el brazo. </w:t>
+          <w:sz w:val="21"/>
+        </w:rPr>
+        <w:t xml:space="preserve">Uso: </w:t>
+      </w:r>
+      <w:r>
+        <w:rPr>
+          <w:sz w:val="21"/>
+        </w:rPr>
+        <w:t xml:space="preserve">Saber dónde está cada casilla y qué movimiento corresponde. </w:t>
       </w:r>
       <w:r>
         <w:rPr>
           <w:b/>
-          <w:sz w:val="20"/>
-        </w:rPr>
-        <w:t xml:space="preserve">Para qué sirve: </w:t>
-      </w:r>
-      <w:r>
-        <w:rPr>
-          <w:sz w:val="20"/>
-        </w:rPr>
-        <w:t xml:space="preserve">Preparar y probar por separado movimiento, altura e imán. </w:t>
-      </w:r>
-      <w:r>
-        <w:rPr>
-          <w:b/>
-          <w:sz w:val="20"/>
+          <w:sz w:val="21"/>
         </w:rPr>
         <w:t xml:space="preserve">Por qué se usó: </w:t>
       </w:r>
       <w:r>
         <w:rPr>
-          <w:sz w:val="20"/>
-        </w:rPr>
-        <w:t>Permite aprender y detectar problemas antes de coordinar una jugada completa.</w:t>
+          <w:sz w:val="21"/>
+        </w:rPr>
+        <w:t>Una imagen o un número no coinciden automáticamente con una posición física. Cámara, tablero y motores requieren sus propias comprobaciones.</w:t>
       </w:r>
     </w:p>
     <w:p>
       <w:pPr>
-        <w:spacing w:after="120" w:line="254" w:lineRule="auto"/>
+        <w:spacing w:after="140" w:line="259" w:lineRule="auto"/>
       </w:pPr>
       <w:r>
         <w:rPr>
-          <w:sz w:val="20"/>
+          <w:sz w:val="21"/>
         </w:rPr>
       </w:r>
       <w:r>
         <w:rPr>
           <w:b/>
-          <w:sz w:val="20"/>
-        </w:rPr>
-        <w:t xml:space="preserve">Stockfish. </w:t>
+          <w:sz w:val="21"/>
+        </w:rPr>
+        <w:t xml:space="preserve">NUCLEO / STM32. </w:t>
+      </w:r>
+      <w:r>
+        <w:rPr>
+          <w:sz w:val="21"/>
+        </w:rPr>
+        <w:t xml:space="preserve">NUCLEO es la placa utilizada; STM32 es el circuito programable que contiene. </w:t>
       </w:r>
       <w:r>
         <w:rPr>
           <w:b/>
-          <w:sz w:val="20"/>
-        </w:rPr>
-        <w:t xml:space="preserve">Qué es: </w:t>
-      </w:r>
-      <w:r>
-        <w:rPr>
-          <w:sz w:val="20"/>
-        </w:rPr>
-        <w:t xml:space="preserve">Un programa especializado en analizar posiciones de ajedrez y calcular jugadas. </w:t>
+          <w:sz w:val="21"/>
+        </w:rPr>
+        <w:t xml:space="preserve">Uso: </w:t>
+      </w:r>
+      <w:r>
+        <w:rPr>
+          <w:sz w:val="21"/>
+        </w:rPr>
+        <w:t xml:space="preserve">Recibir órdenes por USB, producir señales para el movimiento y consultar los sensores. </w:t>
       </w:r>
       <w:r>
         <w:rPr>
           <w:b/>
-          <w:sz w:val="20"/>
-        </w:rPr>
-        <w:t xml:space="preserve">Para qué sirve: </w:t>
-      </w:r>
-      <w:r>
-        <w:rPr>
-          <w:sz w:val="20"/>
-        </w:rPr>
-        <w:t xml:space="preserve">Elegir la respuesta del robot durante una partida. </w:t>
-      </w:r>
-      <w:r>
-        <w:rPr>
-          <w:b/>
-          <w:sz w:val="20"/>
+          <w:sz w:val="21"/>
         </w:rPr>
         <w:t xml:space="preserve">Por qué se usó: </w:t>
       </w:r>
       <w:r>
         <w:rPr>
-          <w:sz w:val="20"/>
-        </w:rPr>
-        <w:t>Permite usar un jugador digital ya desarrollado y concentrar el trabajo en conectar tablero, reglas y movimiento. No reconoce imágenes ni controla motores.</w:t>
+          <w:sz w:val="21"/>
+        </w:rPr>
+        <w:t>Forma parte del control original de EduSCARA y permite que la Raspberry se concentre en coordinar las aplicaciones.</w:t>
       </w:r>
     </w:p>
     <w:p>
       <w:pPr>
-        <w:spacing w:after="120" w:line="254" w:lineRule="auto"/>
+        <w:spacing w:after="140" w:line="259" w:lineRule="auto"/>
       </w:pPr>
       <w:r>
         <w:rPr>
-          <w:sz w:val="20"/>
+          <w:sz w:val="21"/>
         </w:rPr>
       </w:r>
       <w:r>
         <w:rPr>
           <w:b/>
-          <w:sz w:val="20"/>
-        </w:rPr>
-        <w:t xml:space="preserve">python-chess. </w:t>
+          <w:sz w:val="21"/>
+        </w:rPr>
+        <w:t xml:space="preserve">USB. </w:t>
+      </w:r>
+      <w:r>
+        <w:rPr>
+          <w:sz w:val="21"/>
+        </w:rPr>
+        <w:t xml:space="preserve">Una conexión por cable para intercambiar datos. </w:t>
       </w:r>
       <w:r>
         <w:rPr>
           <w:b/>
-          <w:sz w:val="20"/>
-        </w:rPr>
-        <w:t xml:space="preserve">Qué es: </w:t>
-      </w:r>
-      <w:r>
-        <w:rPr>
-          <w:sz w:val="20"/>
-        </w:rPr>
-        <w:t xml:space="preserve">Un conjunto de herramientas de programación con las reglas y el estado de una partida. </w:t>
+          <w:sz w:val="21"/>
+        </w:rPr>
+        <w:t xml:space="preserve">Uso: </w:t>
+      </w:r>
+      <w:r>
+        <w:rPr>
+          <w:sz w:val="21"/>
+        </w:rPr>
+        <w:t xml:space="preserve">Comunicar las órdenes y respuestas entre la Raspberry y la placa de control. </w:t>
       </w:r>
       <w:r>
         <w:rPr>
           <w:b/>
-          <w:sz w:val="20"/>
-        </w:rPr>
-        <w:t xml:space="preserve">Para qué sirve: </w:t>
-      </w:r>
-      <w:r>
-        <w:rPr>
-          <w:sz w:val="20"/>
-        </w:rPr>
-        <w:t xml:space="preserve">Comprobar movimientos y mantener la posición del ajedrez. </w:t>
-      </w:r>
-      <w:r>
-        <w:rPr>
-          <w:b/>
-          <w:sz w:val="20"/>
+          <w:sz w:val="21"/>
         </w:rPr>
         <w:t xml:space="preserve">Por qué se usó: </w:t>
       </w:r>
       <w:r>
         <w:rPr>
-          <w:sz w:val="20"/>
-        </w:rPr>
-        <w:t>Evita que el equipo tenga que reescribir todas las reglas para reunirlas con la cámara y Stockfish.</w:t>
+          <w:sz w:val="21"/>
+        </w:rPr>
+        <w:t>Es el enlace que utiliza el control existente. Solo una aplicación lo controla a la vez.</w:t>
       </w:r>
     </w:p>
     <w:p>
       <w:pPr>
-        <w:spacing w:after="120" w:line="254" w:lineRule="auto"/>
+        <w:spacing w:after="140" w:line="259" w:lineRule="auto"/>
       </w:pPr>
       <w:r>
         <w:rPr>
-          <w:sz w:val="20"/>
+          <w:sz w:val="21"/>
         </w:rPr>
       </w:r>
       <w:r>
         <w:rPr>
           <w:b/>
-          <w:sz w:val="20"/>
-        </w:rPr>
-        <w:t xml:space="preserve">ChatGPT Codex. </w:t>
+          <w:sz w:val="21"/>
+        </w:rPr>
+        <w:t xml:space="preserve">Fuente de alimentación. </w:t>
+      </w:r>
+      <w:r>
+        <w:rPr>
+          <w:sz w:val="21"/>
+        </w:rPr>
+        <w:t xml:space="preserve">Un dispositivo que entrega electricidad con las características que necesita un equipo. </w:t>
       </w:r>
       <w:r>
         <w:rPr>
           <w:b/>
-          <w:sz w:val="20"/>
-        </w:rPr>
-        <w:t xml:space="preserve">Qué es: </w:t>
-      </w:r>
-      <w:r>
-        <w:rPr>
-          <w:sz w:val="20"/>
-        </w:rPr>
-        <w:t xml:space="preserve">Una herramienta de inteligencia artificial con la que se conversa para trabajar sobre programas. </w:t>
+          <w:sz w:val="21"/>
+        </w:rPr>
+        <w:t xml:space="preserve">Uso: </w:t>
+      </w:r>
+      <w:r>
+        <w:rPr>
+          <w:sz w:val="21"/>
+        </w:rPr>
+        <w:t xml:space="preserve">Alimentar computadora, motores o electroimán según el circuito. </w:t>
       </w:r>
       <w:r>
         <w:rPr>
           <w:b/>
-          <w:sz w:val="20"/>
-        </w:rPr>
-        <w:t xml:space="preserve">Para qué sirve: </w:t>
-      </w:r>
-      <w:r>
-        <w:rPr>
-          <w:sz w:val="20"/>
-        </w:rPr>
-        <w:t xml:space="preserve">Comprender código, proponer cambios, preparar pruebas e interfaces. </w:t>
-      </w:r>
-      <w:r>
-        <w:rPr>
-          <w:b/>
-          <w:sz w:val="20"/>
+          <w:sz w:val="21"/>
         </w:rPr>
         <w:t xml:space="preserve">Por qué se usó: </w:t>
       </w:r>
       <w:r>
         <w:rPr>
-          <w:sz w:val="20"/>
-        </w:rPr>
-        <w:t>Ayudó a adaptar EduSCARA a las necesidades del proyecto. El equipo aporta medidas y comprobaciones; Codex no elige las jugadas en esta implementación.</w:t>
+          <w:sz w:val="21"/>
+        </w:rPr>
+        <w:t>Esos elementos no se alimentan todos de la misma forma; una salida de control no debe suministrar directamente toda la corriente del imán.</w:t>
       </w:r>
     </w:p>
     <w:p>
       <w:pPr>
-        <w:spacing w:after="120" w:line="254" w:lineRule="auto"/>
+        <w:spacing w:after="140" w:line="259" w:lineRule="auto"/>
       </w:pPr>
       <w:r>
         <w:rPr>
-          <w:sz w:val="20"/>
+          <w:sz w:val="21"/>
         </w:rPr>
       </w:r>
       <w:r>
         <w:rPr>
           <w:b/>
-          <w:sz w:val="20"/>
-        </w:rPr>
-        <w:t xml:space="preserve">Código / programa. </w:t>
+          <w:sz w:val="21"/>
+        </w:rPr>
+        <w:t xml:space="preserve">MOSFET / módulo de potencia. </w:t>
+      </w:r>
+      <w:r>
+        <w:rPr>
+          <w:sz w:val="21"/>
+        </w:rPr>
+        <w:t xml:space="preserve">Un interruptor electrónico controlado por una señal pequeña. </w:t>
       </w:r>
       <w:r>
         <w:rPr>
           <w:b/>
-          <w:sz w:val="20"/>
-        </w:rPr>
-        <w:t xml:space="preserve">Qué es: </w:t>
-      </w:r>
-      <w:r>
-        <w:rPr>
-          <w:sz w:val="20"/>
-        </w:rPr>
-        <w:t xml:space="preserve">El conjunto de instrucciones escritas para que una computadora o placa realice una tarea. </w:t>
+          <w:sz w:val="21"/>
+        </w:rPr>
+        <w:t xml:space="preserve">Uso: </w:t>
+      </w:r>
+      <w:r>
+        <w:rPr>
+          <w:sz w:val="21"/>
+        </w:rPr>
+        <w:t xml:space="preserve">Permitir o cortar la corriente que alimenta el electroimán. </w:t>
       </w:r>
       <w:r>
         <w:rPr>
           <w:b/>
-          <w:sz w:val="20"/>
-        </w:rPr>
-        <w:t xml:space="preserve">Para qué sirve: </w:t>
-      </w:r>
-      <w:r>
-        <w:rPr>
-          <w:sz w:val="20"/>
-        </w:rPr>
-        <w:t xml:space="preserve">Organizar qué hacer, cuándo hacerlo y qué revisar. </w:t>
-      </w:r>
-      <w:r>
-        <w:rPr>
-          <w:b/>
-          <w:sz w:val="20"/>
+          <w:sz w:val="21"/>
         </w:rPr>
         <w:t xml:space="preserve">Por qué se usó: </w:t>
       </w:r>
       <w:r>
         <w:rPr>
-          <w:sz w:val="20"/>
-        </w:rPr>
-        <w:t>Los componentes conectados no se coordinan solos: necesitan instrucciones y comprobaciones.</w:t>
-      </w:r>
-    </w:p>
-    <w:p>
-      <w:pPr>
-        <w:spacing w:after="120" w:line="254" w:lineRule="auto"/>
-      </w:pPr>
-      <w:r>
-        <w:rPr>
-          <w:sz w:val="20"/>
-        </w:rPr>
-      </w:r>
-      <w:r>
-        <w:rPr>
-          <w:b/>
-          <w:sz w:val="20"/>
-        </w:rPr>
-        <w:t xml:space="preserve">Python y C. </w:t>
-      </w:r>
-      <w:r>
-        <w:rPr>
-          <w:b/>
-          <w:sz w:val="20"/>
-        </w:rPr>
-        <w:t xml:space="preserve">Qué es: </w:t>
-      </w:r>
-      <w:r>
-        <w:rPr>
-          <w:sz w:val="20"/>
-        </w:rPr>
-        <w:t xml:space="preserve">Dos lenguajes para escribir instrucciones de programación. </w:t>
-      </w:r>
-      <w:r>
-        <w:rPr>
-          <w:b/>
-          <w:sz w:val="20"/>
-        </w:rPr>
-        <w:t xml:space="preserve">Para qué sirve: </w:t>
-      </w:r>
-      <w:r>
-        <w:rPr>
-          <w:sz w:val="20"/>
-        </w:rPr>
-        <w:t xml:space="preserve">Python organiza las aplicaciones; C se usa en el programa que controla la placa STM32. </w:t>
-      </w:r>
-      <w:r>
-        <w:rPr>
-          <w:b/>
-          <w:sz w:val="20"/>
-        </w:rPr>
-        <w:t xml:space="preserve">Por qué se usó: </w:t>
-      </w:r>
-      <w:r>
-        <w:rPr>
-          <w:sz w:val="20"/>
-        </w:rPr>
-        <w:t>Se emplearon las herramientas adecuadas a cada parte y se aprovechó la base original de EduSCARA. Solo se nombran si el jurado pregunta por la programación.</w:t>
-      </w:r>
-    </w:p>
-    <w:p>
-      <w:pPr>
-        <w:spacing w:after="120" w:line="254" w:lineRule="auto"/>
-      </w:pPr>
-      <w:r>
-        <w:rPr>
-          <w:sz w:val="20"/>
-        </w:rPr>
-      </w:r>
-      <w:r>
-        <w:rPr>
-          <w:b/>
-          <w:sz w:val="20"/>
-        </w:rPr>
-        <w:t xml:space="preserve">Firmware. </w:t>
-      </w:r>
-      <w:r>
-        <w:rPr>
-          <w:b/>
-          <w:sz w:val="20"/>
-        </w:rPr>
-        <w:t xml:space="preserve">Qué es: </w:t>
-      </w:r>
-      <w:r>
-        <w:rPr>
-          <w:sz w:val="20"/>
-        </w:rPr>
-        <w:t xml:space="preserve">El programa que se guarda y ejecuta dentro de una placa de control. </w:t>
-      </w:r>
-      <w:r>
-        <w:rPr>
-          <w:b/>
-          <w:sz w:val="20"/>
-        </w:rPr>
-        <w:t xml:space="preserve">Para qué sirve: </w:t>
-      </w:r>
-      <w:r>
-        <w:rPr>
-          <w:sz w:val="20"/>
-        </w:rPr>
-        <w:t xml:space="preserve">Convertir órdenes en señales y lecturas del equipo. </w:t>
-      </w:r>
-      <w:r>
-        <w:rPr>
-          <w:b/>
-          <w:sz w:val="20"/>
-        </w:rPr>
-        <w:t xml:space="preserve">Por qué se usó: </w:t>
-      </w:r>
-      <w:r>
-        <w:rPr>
-          <w:sz w:val="20"/>
-        </w:rPr>
-        <w:t>Permite que la STM32 maneje los elementos físicos. En la exposición basta decir «programa de la placa».</w:t>
-      </w:r>
-    </w:p>
-    <w:p>
-      <w:pPr>
-        <w:spacing w:after="120" w:line="254" w:lineRule="auto"/>
-      </w:pPr>
-      <w:r>
-        <w:rPr>
-          <w:sz w:val="20"/>
-        </w:rPr>
-      </w:r>
-      <w:r>
-        <w:rPr>
-          <w:b/>
-          <w:sz w:val="20"/>
-        </w:rPr>
-        <w:t xml:space="preserve">Máquina de estados. </w:t>
-      </w:r>
-      <w:r>
-        <w:rPr>
-          <w:b/>
-          <w:sz w:val="20"/>
-        </w:rPr>
-        <w:t xml:space="preserve">Qué es: </w:t>
-      </w:r>
-      <w:r>
-        <w:rPr>
-          <w:sz w:val="20"/>
-        </w:rPr>
-        <w:t xml:space="preserve">Una organización del programa por etapas, con condiciones para pasar de una a otra. </w:t>
-      </w:r>
-      <w:r>
-        <w:rPr>
-          <w:b/>
-          <w:sz w:val="20"/>
-        </w:rPr>
-        <w:t xml:space="preserve">Para qué sirve: </w:t>
-      </w:r>
-      <w:r>
-        <w:rPr>
-          <w:sz w:val="20"/>
-        </w:rPr>
-        <w:t xml:space="preserve">Separar turno humano, comprobación, cálculo, traslado y revisión. </w:t>
-      </w:r>
-      <w:r>
-        <w:rPr>
-          <w:b/>
-          <w:sz w:val="20"/>
-        </w:rPr>
-        <w:t xml:space="preserve">Por qué se usó: </w:t>
-      </w:r>
-      <w:r>
-        <w:rPr>
-          <w:sz w:val="20"/>
-        </w:rPr>
-        <w:t>Evita tratar una orden recibida como si toda la tarea ya estuviera terminada. En la exposición se explica con la comparación de una receta.</w:t>
-      </w:r>
-    </w:p>
-    <w:p>
-      <w:r>
-        <w:br w:type="page"/>
+          <w:sz w:val="21"/>
+        </w:rPr>
+        <w:t>La placa da la orden y el módulo maneja la corriente del dispositivo. Las protecciones concretas se describen únicamente según el circuito instalado y comprobado.</w:t>
       </w:r>
     </w:p>
     <w:p>
       <w:pPr>
         <w:pStyle w:val="Heading1"/>
+        <w:pageBreakBefore/>
+      </w:pPr>
+      <w:r>
+        <w:t>Programas y aprendizaje explicados</w:t>
+      </w:r>
+    </w:p>
+    <w:p>
+      <w:pPr>
+        <w:spacing w:after="200"/>
+      </w:pPr>
+      <w:r>
+        <w:rPr>
+          <w:sz w:val="20"/>
+        </w:rPr>
+        <w:t>Cada entrada explica qué es, para qué sirve y por qué lo usamos. Es apoyo para estudiar y responder; no se lee como una lista durante la exposición.</w:t>
+      </w:r>
+    </w:p>
+    <w:p>
+      <w:pPr>
+        <w:spacing w:after="140" w:line="259" w:lineRule="auto"/>
+      </w:pPr>
+      <w:r>
+        <w:rPr>
+          <w:sz w:val="21"/>
+        </w:rPr>
+      </w:r>
+      <w:r>
+        <w:rPr>
+          <w:b/>
+          <w:sz w:val="21"/>
+        </w:rPr>
+        <w:t xml:space="preserve">Aplicación manual. </w:t>
+      </w:r>
+      <w:r>
+        <w:rPr>
+          <w:sz w:val="21"/>
+        </w:rPr>
+        <w:t xml:space="preserve">La pantalla con botones para controlar el brazo. </w:t>
+      </w:r>
+      <w:r>
+        <w:rPr>
+          <w:b/>
+          <w:sz w:val="21"/>
+        </w:rPr>
+        <w:t xml:space="preserve">Uso: </w:t>
+      </w:r>
+      <w:r>
+        <w:rPr>
+          <w:sz w:val="21"/>
+        </w:rPr>
+        <w:t xml:space="preserve">Preparar y probar por separado movimiento, altura e imán. </w:t>
+      </w:r>
+      <w:r>
+        <w:rPr>
+          <w:b/>
+          <w:sz w:val="21"/>
+        </w:rPr>
+        <w:t xml:space="preserve">Por qué se usó: </w:t>
+      </w:r>
+      <w:r>
+        <w:rPr>
+          <w:sz w:val="21"/>
+        </w:rPr>
+        <w:t>Permite aprender y detectar problemas antes de coordinar una jugada completa.</w:t>
+      </w:r>
+    </w:p>
+    <w:p>
+      <w:pPr>
+        <w:spacing w:after="140" w:line="259" w:lineRule="auto"/>
+      </w:pPr>
+      <w:r>
+        <w:rPr>
+          <w:sz w:val="21"/>
+        </w:rPr>
+      </w:r>
+      <w:r>
+        <w:rPr>
+          <w:b/>
+          <w:sz w:val="21"/>
+        </w:rPr>
+        <w:t xml:space="preserve">Stockfish. </w:t>
+      </w:r>
+      <w:r>
+        <w:rPr>
+          <w:sz w:val="21"/>
+        </w:rPr>
+        <w:t xml:space="preserve">Un programa especializado en analizar posiciones de ajedrez y calcular jugadas. </w:t>
+      </w:r>
+      <w:r>
+        <w:rPr>
+          <w:b/>
+          <w:sz w:val="21"/>
+        </w:rPr>
+        <w:t xml:space="preserve">Uso: </w:t>
+      </w:r>
+      <w:r>
+        <w:rPr>
+          <w:sz w:val="21"/>
+        </w:rPr>
+        <w:t xml:space="preserve">Elegir la respuesta del robot durante una partida. </w:t>
+      </w:r>
+      <w:r>
+        <w:rPr>
+          <w:b/>
+          <w:sz w:val="21"/>
+        </w:rPr>
+        <w:t xml:space="preserve">Por qué se usó: </w:t>
+      </w:r>
+      <w:r>
+        <w:rPr>
+          <w:sz w:val="21"/>
+        </w:rPr>
+        <w:t>Permite usar un jugador digital ya desarrollado y concentrar el trabajo en conectar tablero, reglas y movimiento. No reconoce imágenes ni controla motores.</w:t>
+      </w:r>
+    </w:p>
+    <w:p>
+      <w:pPr>
+        <w:spacing w:after="140" w:line="259" w:lineRule="auto"/>
+      </w:pPr>
+      <w:r>
+        <w:rPr>
+          <w:sz w:val="21"/>
+        </w:rPr>
+      </w:r>
+      <w:r>
+        <w:rPr>
+          <w:b/>
+          <w:sz w:val="21"/>
+        </w:rPr>
+        <w:t xml:space="preserve">python-chess. </w:t>
+      </w:r>
+      <w:r>
+        <w:rPr>
+          <w:sz w:val="21"/>
+        </w:rPr>
+        <w:t xml:space="preserve">Un conjunto de herramientas de programación con las reglas y el estado de una partida. </w:t>
+      </w:r>
+      <w:r>
+        <w:rPr>
+          <w:b/>
+          <w:sz w:val="21"/>
+        </w:rPr>
+        <w:t xml:space="preserve">Uso: </w:t>
+      </w:r>
+      <w:r>
+        <w:rPr>
+          <w:sz w:val="21"/>
+        </w:rPr>
+        <w:t xml:space="preserve">Comprobar movimientos y mantener la posición del ajedrez. </w:t>
+      </w:r>
+      <w:r>
+        <w:rPr>
+          <w:b/>
+          <w:sz w:val="21"/>
+        </w:rPr>
+        <w:t xml:space="preserve">Por qué se usó: </w:t>
+      </w:r>
+      <w:r>
+        <w:rPr>
+          <w:sz w:val="21"/>
+        </w:rPr>
+        <w:t>Evita que el equipo tenga que reescribir todas las reglas para reunirlas con la cámara y Stockfish.</w:t>
+      </w:r>
+    </w:p>
+    <w:p>
+      <w:pPr>
+        <w:spacing w:after="140" w:line="259" w:lineRule="auto"/>
+      </w:pPr>
+      <w:r>
+        <w:rPr>
+          <w:sz w:val="21"/>
+        </w:rPr>
+      </w:r>
+      <w:r>
+        <w:rPr>
+          <w:b/>
+          <w:sz w:val="21"/>
+        </w:rPr>
+        <w:t xml:space="preserve">ChatGPT Codex. </w:t>
+      </w:r>
+      <w:r>
+        <w:rPr>
+          <w:sz w:val="21"/>
+        </w:rPr>
+        <w:t xml:space="preserve">Una herramienta de inteligencia artificial con la que se conversa para trabajar sobre programas. </w:t>
+      </w:r>
+      <w:r>
+        <w:rPr>
+          <w:b/>
+          <w:sz w:val="21"/>
+        </w:rPr>
+        <w:t xml:space="preserve">Uso: </w:t>
+      </w:r>
+      <w:r>
+        <w:rPr>
+          <w:sz w:val="21"/>
+        </w:rPr>
+        <w:t xml:space="preserve">Comprender código, proponer cambios, preparar pruebas e interfaces. </w:t>
+      </w:r>
+      <w:r>
+        <w:rPr>
+          <w:b/>
+          <w:sz w:val="21"/>
+        </w:rPr>
+        <w:t xml:space="preserve">Por qué se usó: </w:t>
+      </w:r>
+      <w:r>
+        <w:rPr>
+          <w:sz w:val="21"/>
+        </w:rPr>
+        <w:t>Ayudó a adaptar EduSCARA a las necesidades del proyecto. El equipo aporta medidas y comprobaciones; Codex no elige las jugadas en esta implementación.</w:t>
+      </w:r>
+    </w:p>
+    <w:p>
+      <w:pPr>
+        <w:spacing w:after="140" w:line="259" w:lineRule="auto"/>
+      </w:pPr>
+      <w:r>
+        <w:rPr>
+          <w:sz w:val="21"/>
+        </w:rPr>
+      </w:r>
+      <w:r>
+        <w:rPr>
+          <w:b/>
+          <w:sz w:val="21"/>
+        </w:rPr>
+        <w:t xml:space="preserve">Código / programa. </w:t>
+      </w:r>
+      <w:r>
+        <w:rPr>
+          <w:sz w:val="21"/>
+        </w:rPr>
+        <w:t xml:space="preserve">El conjunto de instrucciones escritas para que una computadora o placa realice una tarea. </w:t>
+      </w:r>
+      <w:r>
+        <w:rPr>
+          <w:b/>
+          <w:sz w:val="21"/>
+        </w:rPr>
+        <w:t xml:space="preserve">Uso: </w:t>
+      </w:r>
+      <w:r>
+        <w:rPr>
+          <w:sz w:val="21"/>
+        </w:rPr>
+        <w:t xml:space="preserve">Organizar qué hacer, cuándo hacerlo y qué revisar. </w:t>
+      </w:r>
+      <w:r>
+        <w:rPr>
+          <w:b/>
+          <w:sz w:val="21"/>
+        </w:rPr>
+        <w:t xml:space="preserve">Por qué se usó: </w:t>
+      </w:r>
+      <w:r>
+        <w:rPr>
+          <w:sz w:val="21"/>
+        </w:rPr>
+        <w:t>Los componentes conectados no se coordinan solos: necesitan instrucciones y comprobaciones.</w:t>
+      </w:r>
+    </w:p>
+    <w:p>
+      <w:pPr>
+        <w:spacing w:after="140" w:line="259" w:lineRule="auto"/>
+      </w:pPr>
+      <w:r>
+        <w:rPr>
+          <w:sz w:val="21"/>
+        </w:rPr>
+      </w:r>
+      <w:r>
+        <w:rPr>
+          <w:b/>
+          <w:sz w:val="21"/>
+        </w:rPr>
+        <w:t xml:space="preserve">Python y C. </w:t>
+      </w:r>
+      <w:r>
+        <w:rPr>
+          <w:sz w:val="21"/>
+        </w:rPr>
+        <w:t xml:space="preserve">Dos lenguajes para escribir instrucciones de programación. </w:t>
+      </w:r>
+      <w:r>
+        <w:rPr>
+          <w:b/>
+          <w:sz w:val="21"/>
+        </w:rPr>
+        <w:t xml:space="preserve">Uso: </w:t>
+      </w:r>
+      <w:r>
+        <w:rPr>
+          <w:sz w:val="21"/>
+        </w:rPr>
+        <w:t xml:space="preserve">Python organiza las aplicaciones; C se usa en el programa que controla la placa STM32. </w:t>
+      </w:r>
+      <w:r>
+        <w:rPr>
+          <w:b/>
+          <w:sz w:val="21"/>
+        </w:rPr>
+        <w:t xml:space="preserve">Por qué se usó: </w:t>
+      </w:r>
+      <w:r>
+        <w:rPr>
+          <w:sz w:val="21"/>
+        </w:rPr>
+        <w:t>Se emplearon las herramientas adecuadas a cada parte y se aprovechó la base original de EduSCARA. Solo se nombran si el jurado pregunta por la programación.</w:t>
+      </w:r>
+    </w:p>
+    <w:p>
+      <w:pPr>
+        <w:spacing w:after="140" w:line="259" w:lineRule="auto"/>
+      </w:pPr>
+      <w:r>
+        <w:rPr>
+          <w:sz w:val="21"/>
+        </w:rPr>
+      </w:r>
+      <w:r>
+        <w:rPr>
+          <w:b/>
+          <w:sz w:val="21"/>
+        </w:rPr>
+        <w:t xml:space="preserve">Firmware. </w:t>
+      </w:r>
+      <w:r>
+        <w:rPr>
+          <w:sz w:val="21"/>
+        </w:rPr>
+        <w:t xml:space="preserve">El programa que se guarda y ejecuta dentro de una placa de control. </w:t>
+      </w:r>
+      <w:r>
+        <w:rPr>
+          <w:b/>
+          <w:sz w:val="21"/>
+        </w:rPr>
+        <w:t xml:space="preserve">Uso: </w:t>
+      </w:r>
+      <w:r>
+        <w:rPr>
+          <w:sz w:val="21"/>
+        </w:rPr>
+        <w:t xml:space="preserve">Convertir órdenes en señales y lecturas del equipo. </w:t>
+      </w:r>
+      <w:r>
+        <w:rPr>
+          <w:b/>
+          <w:sz w:val="21"/>
+        </w:rPr>
+        <w:t xml:space="preserve">Por qué se usó: </w:t>
+      </w:r>
+      <w:r>
+        <w:rPr>
+          <w:sz w:val="21"/>
+        </w:rPr>
+        <w:t>Permite que la STM32 maneje los elementos físicos. En la exposición basta decir «programa de la placa».</w:t>
+      </w:r>
+    </w:p>
+    <w:p>
+      <w:pPr>
+        <w:spacing w:after="140" w:line="259" w:lineRule="auto"/>
+      </w:pPr>
+      <w:r>
+        <w:rPr>
+          <w:sz w:val="21"/>
+        </w:rPr>
+      </w:r>
+      <w:r>
+        <w:rPr>
+          <w:b/>
+          <w:sz w:val="21"/>
+        </w:rPr>
+        <w:t xml:space="preserve">Máquina de estados. </w:t>
+      </w:r>
+      <w:r>
+        <w:rPr>
+          <w:sz w:val="21"/>
+        </w:rPr>
+        <w:t xml:space="preserve">Una organización del programa por etapas, con condiciones para pasar de una a otra. </w:t>
+      </w:r>
+      <w:r>
+        <w:rPr>
+          <w:b/>
+          <w:sz w:val="21"/>
+        </w:rPr>
+        <w:t xml:space="preserve">Uso: </w:t>
+      </w:r>
+      <w:r>
+        <w:rPr>
+          <w:sz w:val="21"/>
+        </w:rPr>
+        <w:t xml:space="preserve">Separar turno humano, comprobación, cálculo, traslado y revisión. </w:t>
+      </w:r>
+      <w:r>
+        <w:rPr>
+          <w:b/>
+          <w:sz w:val="21"/>
+        </w:rPr>
+        <w:t xml:space="preserve">Por qué se usó: </w:t>
+      </w:r>
+      <w:r>
+        <w:rPr>
+          <w:sz w:val="21"/>
+        </w:rPr>
+        <w:t>Evita tratar una orden recibida como si toda la tarea ya estuviera terminada. En la exposición se explica con la comparación de una receta.</w:t>
+      </w:r>
+    </w:p>
+    <w:p>
+      <w:pPr>
+        <w:spacing w:after="140" w:line="259" w:lineRule="auto"/>
+      </w:pPr>
+      <w:r>
+        <w:rPr>
+          <w:sz w:val="21"/>
+        </w:rPr>
+      </w:r>
+      <w:r>
+        <w:rPr>
+          <w:b/>
+          <w:sz w:val="21"/>
+        </w:rPr>
+        <w:t xml:space="preserve">Cursos de Arduino - formación previa. </w:t>
+      </w:r>
+      <w:r>
+        <w:rPr>
+          <w:sz w:val="21"/>
+        </w:rPr>
+        <w:t xml:space="preserve">Arduino es una plataforma utilizada para aprender programación y electrónica mediante proyectos con placas y componentes. </w:t>
+      </w:r>
+      <w:r>
+        <w:rPr>
+          <w:b/>
+          <w:sz w:val="21"/>
+        </w:rPr>
+        <w:t xml:space="preserve">Uso: </w:t>
+      </w:r>
+      <w:r>
+        <w:rPr>
+          <w:sz w:val="21"/>
+        </w:rPr>
+        <w:t xml:space="preserve">En los cursos previos el equipo practicó programación, conexiones y conceptos que después pudo aplicar al robot. </w:t>
+      </w:r>
+      <w:r>
+        <w:rPr>
+          <w:b/>
+          <w:sz w:val="21"/>
+        </w:rPr>
+        <w:t xml:space="preserve">Por qué se usó: </w:t>
+      </w:r>
+      <w:r>
+        <w:rPr>
+          <w:sz w:val="21"/>
+        </w:rPr>
+        <w:t>Esos aprendizajes ayudaron a comprender el proyecto. JaqueBot utiliza una placa STM32; mencionar los cursos no significa que el robot esté construido con una placa Arduino.</w:t>
+      </w:r>
+    </w:p>
+    <w:p>
+      <w:pPr>
+        <w:pStyle w:val="Heading1"/>
+        <w:pageBreakBefore/>
       </w:pPr>
       <w:r>
         <w:t>Preguntas del jurado</w:t>
@@ -3497,7 +3505,7 @@
         <w:rPr>
           <w:sz w:val="21"/>
         </w:rPr>
-        <w:t>Desarrollar un brazo que permita explorar tareas de mover objetos y una futura clasificación. Lo construimos y usamos el ajedrez para demostrar cómo reconocer una pieza, decidir un destino y trasladarla. El ejemplo de cajas de medicamentos ayuda a imaginar otra escala; no significa que ya clasifiquemos productos en una empresa.</w:t>
+        <w:t>Aprender a integrar visión artificial, inteligencia artificial y mecánica, aplicando Matemáticas, geometría y Sistemas. Los cursos previos de Arduino nos dieron bases de programación, electrónica y conexiones; en JaqueBot las aplicamos con STM32. Usamos el ajedrez para relacionar una imagen, una decisión y un movimiento. La aplicación industrial es una posibilidad que requiere adaptación y pruebas.</w:t>
       </w:r>
     </w:p>
     <w:p>
@@ -3765,13 +3773,9 @@
       </w:r>
     </w:p>
     <w:p>
-      <w:r>
-        <w:br w:type="page"/>
-      </w:r>
-    </w:p>
-    <w:p>
       <w:pPr>
         <w:pStyle w:val="Heading1"/>
+        <w:pageBreakBefore/>
       </w:pPr>
       <w:r>
         <w:t>Respuestas sobre el proceso y los resultados</w:t>
@@ -3942,7 +3946,7 @@
         <w:rPr>
           <w:sz w:val="21"/>
         </w:rPr>
-        <w:t>A repartir responsabilidades, fabricar y ensamblar, conectar componentes, describir problemas y comprobar soluciones. Aprendimos que un fallo puede venir del programa, de una conexión o de una pieza física, y que conviene revisar por partes.</w:t>
+        <w:t>A aplicar Matemáticas y Sistemas al robot: relacionar imágenes, coordenadas, ángulos y movimiento; usar bases de programación, electrónica y conexiones practicadas en los cursos de Arduino; y reconocer cómo influyen la luz y las etiquetas. La placa del proyecto es STM32. También aprendimos a repartir tareas, probar por partes y comprobar los cambios propuestos por Codex.</w:t>
       </w:r>
     </w:p>
     <w:p>
@@ -3978,7 +3982,7 @@
         <w:rPr>
           <w:sz w:val="21"/>
         </w:rPr>
-        <w:t>El programa calcula y coordina una secuencia, pero las pruebas requieren supervisión por el agarre, la cercanía de las piezas y las referencias que se comprueban a mano. No lo presentamos como un equipo industrial autónomo certificado.</w:t>
+        <w:t>El programa calcula y coordina una secuencia, pero las pruebas requieren supervisión por el agarre, la cercanía de las piezas y las referencias que se comprueban a mano.</w:t>
       </w:r>
     </w:p>
     <w:p>
@@ -4104,13 +4108,9 @@
       </w:hyperlink>
     </w:p>
     <w:p>
-      <w:r>
-        <w:br w:type="page"/>
-      </w:r>
-    </w:p>
-    <w:p>
       <w:pPr>
         <w:pStyle w:val="Heading1"/>
+        <w:pageBreakBefore/>
       </w:pPr>
       <w:r>
         <w:t>Anexo de materiales comprados</w:t>
@@ -5716,13 +5716,9 @@
       </w:r>
     </w:p>
     <w:p>
-      <w:r>
-        <w:br w:type="page"/>
-      </w:r>
-    </w:p>
-    <w:p>
       <w:pPr>
         <w:pStyle w:val="Heading1"/>
+        <w:pageBreakBefore/>
       </w:pPr>
       <w:r>
         <w:t>Anexo de costos y equipos prestados</w:t>

</xml_diff>